<commit_message>
Technology: how AI is used (no fine-tuning), pipeline, data sources; act updated
</commit_message>
<xml_diff>
--- a/docs/Miraj-AI-Act-en.docx
+++ b/docs/Miraj-AI-Act-en.docx
@@ -1758,6 +1758,1113 @@
                 <w:sz w:val="21"/>
               </w:rPr>
               <w:t>Registration → admin review → profile publication.</w:t>
+            </w:r>
+          </w:p>
+        </w:tc>
+      </w:tr>
+    </w:tbl>
+    <w:p>
+      <w:pPr>
+        <w:spacing w:after="40"/>
+      </w:pPr>
+    </w:p>
+    <w:p>
+      <w:pPr>
+        <w:keepNext/>
+        <w:spacing w:before="160" w:after="120"/>
+      </w:pPr>
+      <w:r>
+        <w:rPr>
+          <w:rFonts w:ascii="Times New Roman" w:hAnsi="Times New Roman" w:cs="Times New Roman" w:eastAsia="Times New Roman"/>
+          <w:b/>
+          <w:color w:val="1F3A8A"/>
+          <w:sz w:val="24"/>
+        </w:rPr>
+        <w:t>4.1. How we use AI</w:t>
+      </w:r>
+    </w:p>
+    <w:p>
+      <w:pPr>
+        <w:spacing w:after="120" w:line="276" w:lineRule="auto"/>
+        <w:jc w:val="both"/>
+      </w:pPr>
+      <w:r>
+        <w:rPr>
+          <w:rFonts w:ascii="Times New Roman" w:hAnsi="Times New Roman" w:cs="Times New Roman" w:eastAsia="Times New Roman"/>
+          <w:b w:val="0"/>
+          <w:i w:val="0"/>
+          <w:sz w:val="24"/>
+        </w:rPr>
+        <w:t>Miraj AI does not train or fine-tune a model. We take a ready, state-of-the-art language model and make it useful for a specific person with context, scripts (prompts) and safety rules.</w:t>
+      </w:r>
+    </w:p>
+    <w:tbl>
+      <w:tblPr>
+        <w:tblStyle w:val="TableGrid"/>
+        <w:tblW w:type="auto" w:w="0"/>
+        <w:jc w:val="center"/>
+        <w:tblLayout w:type="fixed"/>
+        <w:tblLook w:firstColumn="1" w:firstRow="1" w:lastColumn="0" w:lastRow="0" w:noHBand="0" w:noVBand="1" w:val="04A0"/>
+      </w:tblPr>
+      <w:tblGrid>
+        <w:gridCol w:w="4819"/>
+        <w:gridCol w:w="4819"/>
+      </w:tblGrid>
+      <w:tr>
+        <w:trPr>
+          <w:cantSplit w:val="true"/>
+        </w:trPr>
+        <w:tc>
+          <w:tcPr>
+            <w:tcW w:type="dxa" w:w="2835"/>
+            <w:shd w:val="clear" w:color="auto" w:fill="EEF1FB"/>
+          </w:tcPr>
+          <w:p>
+            <w:pPr>
+              <w:spacing w:after="40" w:before="40"/>
+            </w:pPr>
+            <w:r/>
+            <w:r>
+              <w:rPr>
+                <w:rFonts w:ascii="Times New Roman" w:hAnsi="Times New Roman" w:cs="Times New Roman" w:eastAsia="Times New Roman"/>
+                <w:b/>
+                <w:sz w:val="21"/>
+              </w:rPr>
+              <w:t>No fine-tuning</w:t>
+            </w:r>
+          </w:p>
+        </w:tc>
+        <w:tc>
+          <w:tcPr>
+            <w:tcW w:type="dxa" w:w="6803"/>
+          </w:tcPr>
+          <w:p>
+            <w:pPr>
+              <w:spacing w:after="40" w:before="40"/>
+            </w:pPr>
+            <w:r/>
+            <w:r>
+              <w:rPr>
+                <w:rFonts w:ascii="Times New Roman" w:hAnsi="Times New Roman" w:cs="Times New Roman" w:eastAsia="Times New Roman"/>
+                <w:b w:val="0"/>
+                <w:sz w:val="21"/>
+              </w:rPr>
+              <w:t>A ready-made Claude model (Anthropic) is used through the API. We do not change its weights or run our own training.</w:t>
+            </w:r>
+          </w:p>
+        </w:tc>
+      </w:tr>
+      <w:tr>
+        <w:trPr>
+          <w:cantSplit w:val="true"/>
+        </w:trPr>
+        <w:tc>
+          <w:tcPr>
+            <w:tcW w:type="dxa" w:w="2835"/>
+            <w:shd w:val="clear" w:color="auto" w:fill="EEF1FB"/>
+          </w:tcPr>
+          <w:p>
+            <w:pPr>
+              <w:spacing w:after="40" w:before="40"/>
+            </w:pPr>
+            <w:r/>
+            <w:r>
+              <w:rPr>
+                <w:rFonts w:ascii="Times New Roman" w:hAnsi="Times New Roman" w:cs="Times New Roman" w:eastAsia="Times New Roman"/>
+                <w:b/>
+                <w:sz w:val="21"/>
+              </w:rPr>
+              <w:t>Personalization through context</w:t>
+            </w:r>
+          </w:p>
+        </w:tc>
+        <w:tc>
+          <w:tcPr>
+            <w:tcW w:type="dxa" w:w="6803"/>
+          </w:tcPr>
+          <w:p>
+            <w:pPr>
+              <w:spacing w:after="40" w:before="40"/>
+            </w:pPr>
+            <w:r/>
+            <w:r>
+              <w:rPr>
+                <w:rFonts w:ascii="Times New Roman" w:hAnsi="Times New Roman" w:cs="Times New Roman" w:eastAsia="Times New Roman"/>
+                <w:b w:val="0"/>
+                <w:sz w:val="21"/>
+              </w:rPr>
+              <w:t>Every request carries this user's own data: profile, diagnostic, mood, gratitude, planner events and the latest messages.</w:t>
+            </w:r>
+          </w:p>
+        </w:tc>
+      </w:tr>
+      <w:tr>
+        <w:trPr>
+          <w:cantSplit w:val="true"/>
+        </w:trPr>
+        <w:tc>
+          <w:tcPr>
+            <w:tcW w:type="dxa" w:w="2835"/>
+            <w:shd w:val="clear" w:color="auto" w:fill="EEF1FB"/>
+          </w:tcPr>
+          <w:p>
+            <w:pPr>
+              <w:spacing w:after="40" w:before="40"/>
+            </w:pPr>
+            <w:r/>
+            <w:r>
+              <w:rPr>
+                <w:rFonts w:ascii="Times New Roman" w:hAnsi="Times New Roman" w:cs="Times New Roman" w:eastAsia="Times New Roman"/>
+                <w:b/>
+                <w:sz w:val="21"/>
+              </w:rPr>
+              <w:t>User data does not train the model</w:t>
+            </w:r>
+          </w:p>
+        </w:tc>
+        <w:tc>
+          <w:tcPr>
+            <w:tcW w:type="dxa" w:w="6803"/>
+          </w:tcPr>
+          <w:p>
+            <w:pPr>
+              <w:spacing w:after="40" w:before="40"/>
+            </w:pPr>
+            <w:r/>
+            <w:r>
+              <w:rPr>
+                <w:rFonts w:ascii="Times New Roman" w:hAnsi="Times New Roman" w:cs="Times New Roman" w:eastAsia="Times New Roman"/>
+                <w:b w:val="0"/>
+                <w:sz w:val="21"/>
+              </w:rPr>
+              <w:t>Conversations are not used for training. The model does not “remember” you itself: memory is your own data, which we pass into the request.</w:t>
+            </w:r>
+          </w:p>
+        </w:tc>
+      </w:tr>
+    </w:tbl>
+    <w:p>
+      <w:pPr>
+        <w:spacing w:after="40"/>
+      </w:pPr>
+    </w:p>
+    <w:p>
+      <w:pPr>
+        <w:keepNext/>
+        <w:spacing w:before="160" w:after="120"/>
+      </w:pPr>
+      <w:r>
+        <w:rPr>
+          <w:rFonts w:ascii="Times New Roman" w:hAnsi="Times New Roman" w:cs="Times New Roman" w:eastAsia="Times New Roman"/>
+          <w:b/>
+          <w:color w:val="1F3A8A"/>
+          <w:sz w:val="24"/>
+        </w:rPr>
+        <w:t>4.2. The path of one message</w:t>
+      </w:r>
+    </w:p>
+    <w:p>
+      <w:pPr>
+        <w:spacing w:after="120" w:line="276" w:lineRule="auto"/>
+      </w:pPr>
+      <w:r>
+        <w:rPr>
+          <w:rFonts w:ascii="Times New Roman" w:hAnsi="Times New Roman" w:cs="Times New Roman" w:eastAsia="Times New Roman"/>
+          <w:b/>
+          <w:i w:val="0"/>
+          <w:sz w:val="22"/>
+        </w:rPr>
+        <w:t>Message (text or voice)  →  Context (profile, events)  →  Server (token and limit)  →  Claude (pre-trained model)  →  Streamed reply (word by word)  →  On device (chat in SQLite)</w:t>
+      </w:r>
+    </w:p>
+    <w:p>
+      <w:pPr>
+        <w:spacing w:after="120" w:line="276" w:lineRule="auto"/>
+      </w:pPr>
+      <w:r>
+        <w:rPr>
+          <w:rFonts w:ascii="Times New Roman" w:hAnsi="Times New Roman" w:cs="Times New Roman" w:eastAsia="Times New Roman"/>
+          <w:b w:val="0"/>
+          <w:i/>
+          <w:sz w:val="22"/>
+        </w:rPr>
+        <w:t>In parallel, a separate light request extracts events from the text for the planner. In chats between people, messages are checked by AI moderation.</w:t>
+      </w:r>
+    </w:p>
+    <w:p>
+      <w:pPr>
+        <w:keepNext/>
+        <w:spacing w:before="160" w:after="120"/>
+      </w:pPr>
+      <w:r>
+        <w:rPr>
+          <w:rFonts w:ascii="Times New Roman" w:hAnsi="Times New Roman" w:cs="Times New Roman" w:eastAsia="Times New Roman"/>
+          <w:b/>
+          <w:color w:val="1F3A8A"/>
+          <w:sz w:val="24"/>
+        </w:rPr>
+        <w:t>4.3. What is used and what is not</w:t>
+      </w:r>
+    </w:p>
+    <w:tbl>
+      <w:tblPr>
+        <w:tblStyle w:val="TableGrid"/>
+        <w:tblW w:type="auto" w:w="0"/>
+        <w:jc w:val="center"/>
+        <w:tblLayout w:type="fixed"/>
+        <w:tblLook w:firstColumn="1" w:firstRow="1" w:lastColumn="0" w:lastRow="0" w:noHBand="0" w:noVBand="1" w:val="04A0"/>
+      </w:tblPr>
+      <w:tblGrid>
+        <w:gridCol w:w="4819"/>
+        <w:gridCol w:w="4819"/>
+      </w:tblGrid>
+      <w:tr>
+        <w:trPr>
+          <w:tblHeader w:val="true"/>
+        </w:trPr>
+        <w:tc>
+          <w:tcPr>
+            <w:tcW w:type="dxa" w:w="4819"/>
+            <w:shd w:val="clear" w:color="auto" w:fill="1F3A8A"/>
+          </w:tcPr>
+          <w:p>
+            <w:pPr>
+              <w:spacing w:after="40" w:before="40"/>
+            </w:pPr>
+            <w:r/>
+            <w:r>
+              <w:rPr>
+                <w:rFonts w:ascii="Times New Roman" w:hAnsi="Times New Roman" w:cs="Times New Roman" w:eastAsia="Times New Roman"/>
+                <w:b/>
+                <w:color w:val="FFFFFF"/>
+                <w:sz w:val="21"/>
+              </w:rPr>
+              <w:t>Used</w:t>
+            </w:r>
+          </w:p>
+        </w:tc>
+        <w:tc>
+          <w:tcPr>
+            <w:tcW w:type="dxa" w:w="4819"/>
+            <w:shd w:val="clear" w:color="auto" w:fill="1F3A8A"/>
+          </w:tcPr>
+          <w:p>
+            <w:pPr>
+              <w:spacing w:after="40" w:before="40"/>
+            </w:pPr>
+            <w:r/>
+            <w:r>
+              <w:rPr>
+                <w:rFonts w:ascii="Times New Roman" w:hAnsi="Times New Roman" w:cs="Times New Roman" w:eastAsia="Times New Roman"/>
+                <w:b/>
+                <w:color w:val="FFFFFF"/>
+                <w:sz w:val="21"/>
+              </w:rPr>
+              <w:t>Not used</w:t>
+            </w:r>
+          </w:p>
+        </w:tc>
+      </w:tr>
+      <w:tr>
+        <w:trPr>
+          <w:cantSplit w:val="true"/>
+        </w:trPr>
+        <w:tc>
+          <w:tcPr>
+            <w:tcW w:type="dxa" w:w="4819"/>
+          </w:tcPr>
+          <w:p>
+            <w:pPr>
+              <w:spacing w:after="40" w:before="40"/>
+            </w:pPr>
+            <w:r/>
+            <w:r>
+              <w:rPr>
+                <w:rFonts w:ascii="Times New Roman" w:hAnsi="Times New Roman" w:cs="Times New Roman" w:eastAsia="Times New Roman"/>
+                <w:b w:val="0"/>
+                <w:sz w:val="21"/>
+              </w:rPr>
+              <w:t>A ready language model (Claude Sonnet) through the API</w:t>
+            </w:r>
+          </w:p>
+        </w:tc>
+        <w:tc>
+          <w:tcPr>
+            <w:tcW w:type="dxa" w:w="4819"/>
+          </w:tcPr>
+          <w:p>
+            <w:pPr>
+              <w:spacing w:after="40" w:before="40"/>
+            </w:pPr>
+            <w:r/>
+            <w:r>
+              <w:rPr>
+                <w:rFonts w:ascii="Times New Roman" w:hAnsi="Times New Roman" w:cs="Times New Roman" w:eastAsia="Times New Roman"/>
+                <w:b w:val="0"/>
+                <w:sz w:val="21"/>
+              </w:rPr>
+              <w:t>Fine-tuning the model</w:t>
+            </w:r>
+          </w:p>
+        </w:tc>
+      </w:tr>
+      <w:tr>
+        <w:trPr>
+          <w:cantSplit w:val="true"/>
+        </w:trPr>
+        <w:tc>
+          <w:tcPr>
+            <w:tcW w:type="dxa" w:w="4819"/>
+          </w:tcPr>
+          <w:p>
+            <w:pPr>
+              <w:spacing w:after="40" w:before="40"/>
+            </w:pPr>
+            <w:r/>
+            <w:r>
+              <w:rPr>
+                <w:rFonts w:ascii="Times New Roman" w:hAnsi="Times New Roman" w:cs="Times New Roman" w:eastAsia="Times New Roman"/>
+                <w:b w:val="0"/>
+                <w:sz w:val="21"/>
+              </w:rPr>
+              <w:t>Our scripts: 25 exercises, 4 AI psychologists, safety rules</w:t>
+            </w:r>
+          </w:p>
+        </w:tc>
+        <w:tc>
+          <w:tcPr>
+            <w:tcW w:type="dxa" w:w="4819"/>
+          </w:tcPr>
+          <w:p>
+            <w:pPr>
+              <w:spacing w:after="40" w:before="40"/>
+            </w:pPr>
+            <w:r/>
+            <w:r>
+              <w:rPr>
+                <w:rFonts w:ascii="Times New Roman" w:hAnsi="Times New Roman" w:cs="Times New Roman" w:eastAsia="Times New Roman"/>
+                <w:b w:val="0"/>
+                <w:sz w:val="21"/>
+              </w:rPr>
+              <w:t>Our own conversation datasets or medical datasets</w:t>
+            </w:r>
+          </w:p>
+        </w:tc>
+      </w:tr>
+      <w:tr>
+        <w:trPr>
+          <w:cantSplit w:val="true"/>
+        </w:trPr>
+        <w:tc>
+          <w:tcPr>
+            <w:tcW w:type="dxa" w:w="4819"/>
+          </w:tcPr>
+          <w:p>
+            <w:pPr>
+              <w:spacing w:after="40" w:before="40"/>
+            </w:pPr>
+            <w:r/>
+            <w:r>
+              <w:rPr>
+                <w:rFonts w:ascii="Times New Roman" w:hAnsi="Times New Roman" w:cs="Times New Roman" w:eastAsia="Times New Roman"/>
+                <w:b w:val="0"/>
+                <w:sz w:val="21"/>
+              </w:rPr>
+              <w:t>The user's data from their account (with consent)</w:t>
+            </w:r>
+          </w:p>
+        </w:tc>
+        <w:tc>
+          <w:tcPr>
+            <w:tcW w:type="dxa" w:w="4819"/>
+          </w:tcPr>
+          <w:p>
+            <w:pPr>
+              <w:spacing w:after="40" w:before="40"/>
+            </w:pPr>
+            <w:r/>
+            <w:r>
+              <w:rPr>
+                <w:rFonts w:ascii="Times New Roman" w:hAnsi="Times New Roman" w:cs="Times New Roman" w:eastAsia="Times New Roman"/>
+                <w:b w:val="0"/>
+                <w:sz w:val="21"/>
+              </w:rPr>
+              <w:t>Web scraping and purchased databases</w:t>
+            </w:r>
+          </w:p>
+        </w:tc>
+      </w:tr>
+      <w:tr>
+        <w:trPr>
+          <w:cantSplit w:val="true"/>
+        </w:trPr>
+        <w:tc>
+          <w:tcPr>
+            <w:tcW w:type="dxa" w:w="4819"/>
+          </w:tcPr>
+          <w:p>
+            <w:pPr>
+              <w:spacing w:after="40" w:before="40"/>
+            </w:pPr>
+            <w:r/>
+            <w:r>
+              <w:rPr>
+                <w:rFonts w:ascii="Times New Roman" w:hAnsi="Times New Roman" w:cs="Times New Roman" w:eastAsia="Times New Roman"/>
+                <w:b w:val="0"/>
+                <w:sz w:val="21"/>
+              </w:rPr>
+              <w:t>Open WHO statistics — only to justify the problem</w:t>
+            </w:r>
+          </w:p>
+        </w:tc>
+        <w:tc>
+          <w:tcPr>
+            <w:tcW w:type="dxa" w:w="4819"/>
+          </w:tcPr>
+          <w:p>
+            <w:pPr>
+              <w:spacing w:after="40" w:before="40"/>
+            </w:pPr>
+            <w:r/>
+            <w:r>
+              <w:rPr>
+                <w:rFonts w:ascii="Times New Roman" w:hAnsi="Times New Roman" w:cs="Times New Roman" w:eastAsia="Times New Roman"/>
+                <w:b w:val="0"/>
+                <w:sz w:val="21"/>
+              </w:rPr>
+              <w:t>Training on users' conversations</w:t>
+            </w:r>
+          </w:p>
+        </w:tc>
+      </w:tr>
+    </w:tbl>
+    <w:p>
+      <w:pPr>
+        <w:spacing w:after="40"/>
+      </w:pPr>
+    </w:p>
+    <w:p>
+      <w:pPr>
+        <w:keepNext/>
+        <w:spacing w:before="160" w:after="120"/>
+      </w:pPr>
+      <w:r>
+        <w:rPr>
+          <w:rFonts w:ascii="Times New Roman" w:hAnsi="Times New Roman" w:cs="Times New Roman" w:eastAsia="Times New Roman"/>
+          <w:b/>
+          <w:color w:val="1F3A8A"/>
+          <w:sz w:val="24"/>
+        </w:rPr>
+        <w:t>4.4. Why the AI becomes more useful with use</w:t>
+      </w:r>
+    </w:p>
+    <w:p>
+      <w:pPr>
+        <w:spacing w:after="120" w:line="276" w:lineRule="auto"/>
+        <w:jc w:val="both"/>
+      </w:pPr>
+      <w:r>
+        <w:rPr>
+          <w:rFonts w:ascii="Times New Roman" w:hAnsi="Times New Roman" w:cs="Times New Roman" w:eastAsia="Times New Roman"/>
+          <w:b w:val="0"/>
+          <w:i w:val="0"/>
+          <w:sz w:val="24"/>
+        </w:rPr>
+        <w:t>The model itself does not learn from your conversations. The app becomes more useful because your context accumulates and our scripts improve:</w:t>
+      </w:r>
+    </w:p>
+    <w:p>
+      <w:pPr>
+        <w:pStyle w:val="ListBullet"/>
+        <w:spacing w:after="60" w:line="264" w:lineRule="auto"/>
+      </w:pPr>
+      <w:r>
+        <w:rPr>
+          <w:rFonts w:ascii="Times New Roman" w:hAnsi="Times New Roman" w:cs="Times New Roman" w:eastAsia="Times New Roman"/>
+          <w:sz w:val="23"/>
+        </w:rPr>
+        <w:t>Deeper personalization: the more diagnostic, mood, gratitude and goals there are, the more precise the advice and the daily plan.</w:t>
+      </w:r>
+    </w:p>
+    <w:p>
+      <w:pPr>
+        <w:pStyle w:val="ListBullet"/>
+        <w:spacing w:after="60" w:line="264" w:lineRule="auto"/>
+      </w:pPr>
+      <w:r>
+        <w:rPr>
+          <w:rFonts w:ascii="Times New Roman" w:hAnsi="Times New Roman" w:cs="Times New Roman" w:eastAsia="Times New Roman"/>
+          <w:sz w:val="23"/>
+        </w:rPr>
+        <w:t>Memory of plans: events from the chat are saved, and the AI reminds you and helps you prepare.</w:t>
+      </w:r>
+    </w:p>
+    <w:p>
+      <w:pPr>
+        <w:pStyle w:val="ListBullet"/>
+        <w:spacing w:after="60" w:line="264" w:lineRule="auto"/>
+      </w:pPr>
+      <w:r>
+        <w:rPr>
+          <w:rFonts w:ascii="Times New Roman" w:hAnsi="Times New Roman" w:cs="Times New Roman" w:eastAsia="Times New Roman"/>
+          <w:sz w:val="23"/>
+        </w:rPr>
+        <w:t>Feedback: reviews and test results help us improve the scripts and check quality in Tajik.</w:t>
+      </w:r>
+    </w:p>
+    <w:p>
+      <w:pPr>
+        <w:pStyle w:val="ListBullet"/>
+        <w:spacing w:after="60" w:line="264" w:lineRule="auto"/>
+      </w:pPr>
+      <w:r>
+        <w:rPr>
+          <w:rFonts w:ascii="Times New Roman" w:hAnsi="Times New Roman" w:cs="Times New Roman" w:eastAsia="Times New Roman"/>
+          <w:sz w:val="23"/>
+        </w:rPr>
+        <w:t>Updates without a new app version: the protected server lets us connect a stronger model, and everyone gets the improvement at once.</w:t>
+      </w:r>
+    </w:p>
+    <w:p>
+      <w:pPr>
+        <w:spacing w:after="120" w:line="276" w:lineRule="auto"/>
+      </w:pPr>
+      <w:r>
+        <w:rPr>
+          <w:rFonts w:ascii="Times New Roman" w:hAnsi="Times New Roman" w:cs="Times New Roman" w:eastAsia="Times New Roman"/>
+          <w:b w:val="0"/>
+          <w:i/>
+          <w:sz w:val="22"/>
+        </w:rPr>
+        <w:t>Limitation: the improvements are in the context and scripts, not in self-learning of the model; we do not promise that answers will become “smarter” by themselves.</w:t>
+      </w:r>
+    </w:p>
+    <w:p>
+      <w:pPr>
+        <w:keepNext/>
+        <w:spacing w:before="160" w:after="120"/>
+      </w:pPr>
+      <w:r>
+        <w:rPr>
+          <w:rFonts w:ascii="Times New Roman" w:hAnsi="Times New Roman" w:cs="Times New Roman" w:eastAsia="Times New Roman"/>
+          <w:b/>
+          <w:color w:val="1F3A8A"/>
+          <w:sz w:val="24"/>
+        </w:rPr>
+        <w:t>4.5. Data sources</w:t>
+      </w:r>
+    </w:p>
+    <w:tbl>
+      <w:tblPr>
+        <w:tblStyle w:val="TableGrid"/>
+        <w:tblW w:type="auto" w:w="0"/>
+        <w:jc w:val="center"/>
+        <w:tblLayout w:type="fixed"/>
+        <w:tblLook w:firstColumn="1" w:firstRow="1" w:lastColumn="0" w:lastRow="0" w:noHBand="0" w:noVBand="1" w:val="04A0"/>
+      </w:tblPr>
+      <w:tblGrid>
+        <w:gridCol w:w="3213"/>
+        <w:gridCol w:w="3213"/>
+        <w:gridCol w:w="3213"/>
+      </w:tblGrid>
+      <w:tr>
+        <w:trPr>
+          <w:tblHeader w:val="true"/>
+        </w:trPr>
+        <w:tc>
+          <w:tcPr>
+            <w:tcW w:type="dxa" w:w="3175"/>
+            <w:shd w:val="clear" w:color="auto" w:fill="1F3A8A"/>
+          </w:tcPr>
+          <w:p>
+            <w:pPr>
+              <w:spacing w:after="40" w:before="40"/>
+            </w:pPr>
+            <w:r/>
+            <w:r>
+              <w:rPr>
+                <w:rFonts w:ascii="Times New Roman" w:hAnsi="Times New Roman" w:cs="Times New Roman" w:eastAsia="Times New Roman"/>
+                <w:b/>
+                <w:color w:val="FFFFFF"/>
+                <w:sz w:val="21"/>
+              </w:rPr>
+              <w:t>Data</w:t>
+            </w:r>
+          </w:p>
+        </w:tc>
+        <w:tc>
+          <w:tcPr>
+            <w:tcW w:type="dxa" w:w="3061"/>
+            <w:shd w:val="clear" w:color="auto" w:fill="1F3A8A"/>
+          </w:tcPr>
+          <w:p>
+            <w:pPr>
+              <w:spacing w:after="40" w:before="40"/>
+            </w:pPr>
+            <w:r/>
+            <w:r>
+              <w:rPr>
+                <w:rFonts w:ascii="Times New Roman" w:hAnsi="Times New Roman" w:cs="Times New Roman" w:eastAsia="Times New Roman"/>
+                <w:b/>
+                <w:color w:val="FFFFFF"/>
+                <w:sz w:val="21"/>
+              </w:rPr>
+              <w:t>Where it is stored</w:t>
+            </w:r>
+          </w:p>
+        </w:tc>
+        <w:tc>
+          <w:tcPr>
+            <w:tcW w:type="dxa" w:w="3402"/>
+            <w:shd w:val="clear" w:color="auto" w:fill="1F3A8A"/>
+          </w:tcPr>
+          <w:p>
+            <w:pPr>
+              <w:spacing w:after="40" w:before="40"/>
+            </w:pPr>
+            <w:r/>
+            <w:r>
+              <w:rPr>
+                <w:rFonts w:ascii="Times New Roman" w:hAnsi="Times New Roman" w:cs="Times New Roman" w:eastAsia="Times New Roman"/>
+                <w:b/>
+                <w:color w:val="FFFFFF"/>
+                <w:sz w:val="21"/>
+              </w:rPr>
+              <w:t>What for</w:t>
+            </w:r>
+          </w:p>
+        </w:tc>
+      </w:tr>
+      <w:tr>
+        <w:trPr>
+          <w:cantSplit w:val="true"/>
+        </w:trPr>
+        <w:tc>
+          <w:tcPr>
+            <w:tcW w:type="dxa" w:w="3175"/>
+          </w:tcPr>
+          <w:p>
+            <w:pPr>
+              <w:spacing w:after="40" w:before="40"/>
+            </w:pPr>
+            <w:r/>
+            <w:r>
+              <w:rPr>
+                <w:rFonts w:ascii="Times New Roman" w:hAnsi="Times New Roman" w:cs="Times New Roman" w:eastAsia="Times New Roman"/>
+                <w:b w:val="0"/>
+                <w:sz w:val="21"/>
+              </w:rPr>
+              <w:t>Diagnostic answers and the 90-day plan</w:t>
+            </w:r>
+          </w:p>
+        </w:tc>
+        <w:tc>
+          <w:tcPr>
+            <w:tcW w:type="dxa" w:w="3061"/>
+          </w:tcPr>
+          <w:p>
+            <w:pPr>
+              <w:spacing w:after="40" w:before="40"/>
+            </w:pPr>
+            <w:r/>
+            <w:r>
+              <w:rPr>
+                <w:rFonts w:ascii="Times New Roman" w:hAnsi="Times New Roman" w:cs="Times New Roman" w:eastAsia="Times New Roman"/>
+                <w:b w:val="0"/>
+                <w:sz w:val="21"/>
+              </w:rPr>
+              <w:t>Firestore (user account)</w:t>
+            </w:r>
+          </w:p>
+        </w:tc>
+        <w:tc>
+          <w:tcPr>
+            <w:tcW w:type="dxa" w:w="3402"/>
+          </w:tcPr>
+          <w:p>
+            <w:pPr>
+              <w:spacing w:after="40" w:before="40"/>
+            </w:pPr>
+            <w:r/>
+            <w:r>
+              <w:rPr>
+                <w:rFonts w:ascii="Times New Roman" w:hAnsi="Times New Roman" w:cs="Times New Roman" w:eastAsia="Times New Roman"/>
+                <w:b w:val="0"/>
+                <w:sz w:val="21"/>
+              </w:rPr>
+              <w:t>Building the plan, context for chat and coach</w:t>
+            </w:r>
+          </w:p>
+        </w:tc>
+      </w:tr>
+      <w:tr>
+        <w:trPr>
+          <w:cantSplit w:val="true"/>
+        </w:trPr>
+        <w:tc>
+          <w:tcPr>
+            <w:tcW w:type="dxa" w:w="3175"/>
+          </w:tcPr>
+          <w:p>
+            <w:pPr>
+              <w:spacing w:after="40" w:before="40"/>
+            </w:pPr>
+            <w:r/>
+            <w:r>
+              <w:rPr>
+                <w:rFonts w:ascii="Times New Roman" w:hAnsi="Times New Roman" w:cs="Times New Roman" w:eastAsia="Times New Roman"/>
+                <w:b w:val="0"/>
+                <w:sz w:val="21"/>
+              </w:rPr>
+              <w:t>Daily schedule and planner events</w:t>
+            </w:r>
+          </w:p>
+        </w:tc>
+        <w:tc>
+          <w:tcPr>
+            <w:tcW w:type="dxa" w:w="3061"/>
+          </w:tcPr>
+          <w:p>
+            <w:pPr>
+              <w:spacing w:after="40" w:before="40"/>
+            </w:pPr>
+            <w:r/>
+            <w:r>
+              <w:rPr>
+                <w:rFonts w:ascii="Times New Roman" w:hAnsi="Times New Roman" w:cs="Times New Roman" w:eastAsia="Times New Roman"/>
+                <w:b w:val="0"/>
+                <w:sz w:val="21"/>
+              </w:rPr>
+              <w:t>Firestore</w:t>
+            </w:r>
+          </w:p>
+        </w:tc>
+        <w:tc>
+          <w:tcPr>
+            <w:tcW w:type="dxa" w:w="3402"/>
+          </w:tcPr>
+          <w:p>
+            <w:pPr>
+              <w:spacing w:after="40" w:before="40"/>
+            </w:pPr>
+            <w:r/>
+            <w:r>
+              <w:rPr>
+                <w:rFonts w:ascii="Times New Roman" w:hAnsi="Times New Roman" w:cs="Times New Roman" w:eastAsia="Times New Roman"/>
+                <w:b w:val="0"/>
+                <w:sz w:val="21"/>
+              </w:rPr>
+              <w:t>Daily plan, reminders, the AI's memory of plans</w:t>
+            </w:r>
+          </w:p>
+        </w:tc>
+      </w:tr>
+      <w:tr>
+        <w:trPr>
+          <w:cantSplit w:val="true"/>
+        </w:trPr>
+        <w:tc>
+          <w:tcPr>
+            <w:tcW w:type="dxa" w:w="3175"/>
+          </w:tcPr>
+          <w:p>
+            <w:pPr>
+              <w:spacing w:after="40" w:before="40"/>
+            </w:pPr>
+            <w:r/>
+            <w:r>
+              <w:rPr>
+                <w:rFonts w:ascii="Times New Roman" w:hAnsi="Times New Roman" w:cs="Times New Roman" w:eastAsia="Times New Roman"/>
+                <w:b w:val="0"/>
+                <w:sz w:val="21"/>
+              </w:rPr>
+              <w:t>Mood and gratitude</w:t>
+            </w:r>
+          </w:p>
+        </w:tc>
+        <w:tc>
+          <w:tcPr>
+            <w:tcW w:type="dxa" w:w="3061"/>
+          </w:tcPr>
+          <w:p>
+            <w:pPr>
+              <w:spacing w:after="40" w:before="40"/>
+            </w:pPr>
+            <w:r/>
+            <w:r>
+              <w:rPr>
+                <w:rFonts w:ascii="Times New Roman" w:hAnsi="Times New Roman" w:cs="Times New Roman" w:eastAsia="Times New Roman"/>
+                <w:b w:val="0"/>
+                <w:sz w:val="21"/>
+              </w:rPr>
+              <w:t>On device</w:t>
+            </w:r>
+          </w:p>
+        </w:tc>
+        <w:tc>
+          <w:tcPr>
+            <w:tcW w:type="dxa" w:w="3402"/>
+          </w:tcPr>
+          <w:p>
+            <w:pPr>
+              <w:spacing w:after="40" w:before="40"/>
+            </w:pPr>
+            <w:r/>
+            <w:r>
+              <w:rPr>
+                <w:rFonts w:ascii="Times New Roman" w:hAnsi="Times New Roman" w:cs="Times New Roman" w:eastAsia="Times New Roman"/>
+                <w:b w:val="0"/>
+                <w:sz w:val="21"/>
+              </w:rPr>
+              <w:t>Context for chat and coach</w:t>
+            </w:r>
+          </w:p>
+        </w:tc>
+      </w:tr>
+      <w:tr>
+        <w:trPr>
+          <w:cantSplit w:val="true"/>
+        </w:trPr>
+        <w:tc>
+          <w:tcPr>
+            <w:tcW w:type="dxa" w:w="3175"/>
+          </w:tcPr>
+          <w:p>
+            <w:pPr>
+              <w:spacing w:after="40" w:before="40"/>
+            </w:pPr>
+            <w:r/>
+            <w:r>
+              <w:rPr>
+                <w:rFonts w:ascii="Times New Roman" w:hAnsi="Times New Roman" w:cs="Times New Roman" w:eastAsia="Times New Roman"/>
+                <w:b w:val="0"/>
+                <w:sz w:val="21"/>
+              </w:rPr>
+              <w:t>Chat history</w:t>
+            </w:r>
+          </w:p>
+        </w:tc>
+        <w:tc>
+          <w:tcPr>
+            <w:tcW w:type="dxa" w:w="3061"/>
+          </w:tcPr>
+          <w:p>
+            <w:pPr>
+              <w:spacing w:after="40" w:before="40"/>
+            </w:pPr>
+            <w:r/>
+            <w:r>
+              <w:rPr>
+                <w:rFonts w:ascii="Times New Roman" w:hAnsi="Times New Roman" w:cs="Times New Roman" w:eastAsia="Times New Roman"/>
+                <w:b w:val="0"/>
+                <w:sz w:val="21"/>
+              </w:rPr>
+              <w:t>SQLite on the device (+ account history in Firestore)</w:t>
+            </w:r>
+          </w:p>
+        </w:tc>
+        <w:tc>
+          <w:tcPr>
+            <w:tcW w:type="dxa" w:w="3402"/>
+          </w:tcPr>
+          <w:p>
+            <w:pPr>
+              <w:spacing w:after="40" w:before="40"/>
+            </w:pPr>
+            <w:r/>
+            <w:r>
+              <w:rPr>
+                <w:rFonts w:ascii="Times New Roman" w:hAnsi="Times New Roman" w:cs="Times New Roman" w:eastAsia="Times New Roman"/>
+                <w:b w:val="0"/>
+                <w:sz w:val="21"/>
+              </w:rPr>
+              <w:t>Latest messages as context; reading offline</w:t>
+            </w:r>
+          </w:p>
+        </w:tc>
+      </w:tr>
+      <w:tr>
+        <w:trPr>
+          <w:cantSplit w:val="true"/>
+        </w:trPr>
+        <w:tc>
+          <w:tcPr>
+            <w:tcW w:type="dxa" w:w="3175"/>
+          </w:tcPr>
+          <w:p>
+            <w:pPr>
+              <w:spacing w:after="40" w:before="40"/>
+            </w:pPr>
+            <w:r/>
+            <w:r>
+              <w:rPr>
+                <w:rFonts w:ascii="Times New Roman" w:hAnsi="Times New Roman" w:cs="Times New Roman" w:eastAsia="Times New Roman"/>
+                <w:b w:val="0"/>
+                <w:sz w:val="21"/>
+              </w:rPr>
+              <w:t>Scripts of exercises and AI psychologists</w:t>
+            </w:r>
+          </w:p>
+        </w:tc>
+        <w:tc>
+          <w:tcPr>
+            <w:tcW w:type="dxa" w:w="3061"/>
+          </w:tcPr>
+          <w:p>
+            <w:pPr>
+              <w:spacing w:after="40" w:before="40"/>
+            </w:pPr>
+            <w:r/>
+            <w:r>
+              <w:rPr>
+                <w:rFonts w:ascii="Times New Roman" w:hAnsi="Times New Roman" w:cs="Times New Roman" w:eastAsia="Times New Roman"/>
+                <w:b w:val="0"/>
+                <w:sz w:val="21"/>
+              </w:rPr>
+              <w:t>In the app code (our own texts)</w:t>
+            </w:r>
+          </w:p>
+        </w:tc>
+        <w:tc>
+          <w:tcPr>
+            <w:tcW w:type="dxa" w:w="3402"/>
+          </w:tcPr>
+          <w:p>
+            <w:pPr>
+              <w:spacing w:after="40" w:before="40"/>
+            </w:pPr>
+            <w:r/>
+            <w:r>
+              <w:rPr>
+                <w:rFonts w:ascii="Times New Roman" w:hAnsi="Times New Roman" w:cs="Times New Roman" w:eastAsia="Times New Roman"/>
+                <w:b w:val="0"/>
+                <w:sz w:val="21"/>
+              </w:rPr>
+              <w:t>Leading 25 exercises and 4 personas</w:t>
+            </w:r>
+          </w:p>
+        </w:tc>
+      </w:tr>
+      <w:tr>
+        <w:trPr>
+          <w:cantSplit w:val="true"/>
+        </w:trPr>
+        <w:tc>
+          <w:tcPr>
+            <w:tcW w:type="dxa" w:w="3175"/>
+          </w:tcPr>
+          <w:p>
+            <w:pPr>
+              <w:spacing w:after="40" w:before="40"/>
+            </w:pPr>
+            <w:r/>
+            <w:r>
+              <w:rPr>
+                <w:rFonts w:ascii="Times New Roman" w:hAnsi="Times New Roman" w:cs="Times New Roman" w:eastAsia="Times New Roman"/>
+                <w:b w:val="0"/>
+                <w:sz w:val="21"/>
+              </w:rPr>
+              <w:t>Points, levels, streak</w:t>
+            </w:r>
+          </w:p>
+        </w:tc>
+        <w:tc>
+          <w:tcPr>
+            <w:tcW w:type="dxa" w:w="3061"/>
+          </w:tcPr>
+          <w:p>
+            <w:pPr>
+              <w:spacing w:after="40" w:before="40"/>
+            </w:pPr>
+            <w:r/>
+            <w:r>
+              <w:rPr>
+                <w:rFonts w:ascii="Times New Roman" w:hAnsi="Times New Roman" w:cs="Times New Roman" w:eastAsia="Times New Roman"/>
+                <w:b w:val="0"/>
+                <w:sz w:val="21"/>
+              </w:rPr>
+              <w:t>Firestore</w:t>
+            </w:r>
+          </w:p>
+        </w:tc>
+        <w:tc>
+          <w:tcPr>
+            <w:tcW w:type="dxa" w:w="3402"/>
+          </w:tcPr>
+          <w:p>
+            <w:pPr>
+              <w:spacing w:after="40" w:before="40"/>
+            </w:pPr>
+            <w:r/>
+            <w:r>
+              <w:rPr>
+                <w:rFonts w:ascii="Times New Roman" w:hAnsi="Times New Roman" w:cs="Times New Roman" w:eastAsia="Times New Roman"/>
+                <w:b w:val="0"/>
+                <w:sz w:val="21"/>
+              </w:rPr>
+              <w:t>Motivation and progress</w:t>
+            </w:r>
+          </w:p>
+        </w:tc>
+      </w:tr>
+      <w:tr>
+        <w:trPr>
+          <w:cantSplit w:val="true"/>
+        </w:trPr>
+        <w:tc>
+          <w:tcPr>
+            <w:tcW w:type="dxa" w:w="3175"/>
+          </w:tcPr>
+          <w:p>
+            <w:pPr>
+              <w:spacing w:after="40" w:before="40"/>
+            </w:pPr>
+            <w:r/>
+            <w:r>
+              <w:rPr>
+                <w:rFonts w:ascii="Times New Roman" w:hAnsi="Times New Roman" w:cs="Times New Roman" w:eastAsia="Times New Roman"/>
+                <w:b w:val="0"/>
+                <w:sz w:val="21"/>
+              </w:rPr>
+              <w:t>WHO statistics</w:t>
+            </w:r>
+          </w:p>
+        </w:tc>
+        <w:tc>
+          <w:tcPr>
+            <w:tcW w:type="dxa" w:w="3061"/>
+          </w:tcPr>
+          <w:p>
+            <w:pPr>
+              <w:spacing w:after="40" w:before="40"/>
+            </w:pPr>
+            <w:r/>
+            <w:r>
+              <w:rPr>
+                <w:rFonts w:ascii="Times New Roman" w:hAnsi="Times New Roman" w:cs="Times New Roman" w:eastAsia="Times New Roman"/>
+                <w:b w:val="0"/>
+                <w:sz w:val="21"/>
+              </w:rPr>
+              <w:t>Open sources</w:t>
+            </w:r>
+          </w:p>
+        </w:tc>
+        <w:tc>
+          <w:tcPr>
+            <w:tcW w:type="dxa" w:w="3402"/>
+          </w:tcPr>
+          <w:p>
+            <w:pPr>
+              <w:spacing w:after="40" w:before="40"/>
+            </w:pPr>
+            <w:r/>
+            <w:r>
+              <w:rPr>
+                <w:rFonts w:ascii="Times New Roman" w:hAnsi="Times New Roman" w:cs="Times New Roman" w:eastAsia="Times New Roman"/>
+                <w:b w:val="0"/>
+                <w:sz w:val="21"/>
+              </w:rPr>
+              <w:t>Only to justify the problem, not for training</w:t>
             </w:r>
           </w:p>
         </w:tc>

</xml_diff>

<commit_message>
Act: sections 4.1-4.5 aligned with new AI architecture (honest implemented/planned status)
Co-Authored-By: Claude Sonnet 5.5 <noreply@anthropic.com>
</commit_message>
<xml_diff>
--- a/docs/Miraj-AI-Act-en.docx
+++ b/docs/Miraj-AI-Act-en.docx
@@ -1780,7 +1780,7 @@
           <w:color w:val="1F3A8A"/>
           <w:sz w:val="24"/>
         </w:rPr>
-        <w:t>4.1. How we use AI</w:t>
+        <w:t>4.1. Context Engineering: Building Intelligence Around the Model</w:t>
       </w:r>
     </w:p>
     <w:p>
@@ -1795,7 +1795,7 @@
           <w:i w:val="0"/>
           <w:sz w:val="24"/>
         </w:rPr>
-        <w:t>Miraj AI does not train or fine-tune a model. We take a ready, state-of-the-art language model and make it useful for a specific person with context, scripts (prompts) and safety rules.</w:t>
+        <w:t>A foundation model gives general language ability. The application decides which instructions and information the model sees for each request. That layer, Context Engineering, is where Miraj's behaviour is designed.</w:t>
       </w:r>
     </w:p>
     <w:tbl>
@@ -1807,17 +1807,18 @@
         <w:tblLook w:firstColumn="1" w:firstRow="1" w:lastColumn="0" w:lastRow="0" w:noHBand="0" w:noVBand="1" w:val="04A0"/>
       </w:tblPr>
       <w:tblGrid>
-        <w:gridCol w:w="4819"/>
-        <w:gridCol w:w="4819"/>
+        <w:gridCol w:w="3213"/>
+        <w:gridCol w:w="3213"/>
+        <w:gridCol w:w="3213"/>
       </w:tblGrid>
       <w:tr>
         <w:trPr>
-          <w:cantSplit w:val="true"/>
+          <w:tblHeader w:val="true"/>
         </w:trPr>
         <w:tc>
           <w:tcPr>
-            <w:tcW w:type="dxa" w:w="2835"/>
-            <w:shd w:val="clear" w:color="auto" w:fill="EEF1FB"/>
+            <w:tcW w:type="dxa" w:w="2381"/>
+            <w:shd w:val="clear" w:color="auto" w:fill="1F3A8A"/>
           </w:tcPr>
           <w:p>
             <w:pPr>
@@ -1828,28 +1829,50 @@
               <w:rPr>
                 <w:rFonts w:ascii="Times New Roman" w:hAnsi="Times New Roman" w:cs="Times New Roman" w:eastAsia="Times New Roman"/>
                 <w:b/>
-                <w:sz w:val="21"/>
-              </w:rPr>
-              <w:t>No fine-tuning</w:t>
-            </w:r>
-          </w:p>
-        </w:tc>
-        <w:tc>
-          <w:tcPr>
-            <w:tcW w:type="dxa" w:w="6803"/>
-          </w:tcPr>
-          <w:p>
-            <w:pPr>
-              <w:spacing w:after="40" w:before="40"/>
-            </w:pPr>
-            <w:r/>
-            <w:r>
-              <w:rPr>
-                <w:rFonts w:ascii="Times New Roman" w:hAnsi="Times New Roman" w:cs="Times New Roman" w:eastAsia="Times New Roman"/>
-                <w:b w:val="0"/>
-                <w:sz w:val="21"/>
-              </w:rPr>
-              <w:t>A ready-made Claude model (Anthropic) is used through the API. We do not change its weights or run our own training.</w:t>
+                <w:color w:val="FFFFFF"/>
+                <w:sz w:val="21"/>
+              </w:rPr>
+            </w:r>
+          </w:p>
+        </w:tc>
+        <w:tc>
+          <w:tcPr>
+            <w:tcW w:type="dxa" w:w="5896"/>
+            <w:shd w:val="clear" w:color="auto" w:fill="1F3A8A"/>
+          </w:tcPr>
+          <w:p>
+            <w:pPr>
+              <w:spacing w:after="40" w:before="40"/>
+            </w:pPr>
+            <w:r/>
+            <w:r>
+              <w:rPr>
+                <w:rFonts w:ascii="Times New Roman" w:hAnsi="Times New Roman" w:cs="Times New Roman" w:eastAsia="Times New Roman"/>
+                <w:b/>
+                <w:color w:val="FFFFFF"/>
+                <w:sz w:val="21"/>
+              </w:rPr>
+            </w:r>
+          </w:p>
+        </w:tc>
+        <w:tc>
+          <w:tcPr>
+            <w:tcW w:type="dxa" w:w="1361"/>
+            <w:shd w:val="clear" w:color="auto" w:fill="1F3A8A"/>
+          </w:tcPr>
+          <w:p>
+            <w:pPr>
+              <w:spacing w:after="40" w:before="40"/>
+            </w:pPr>
+            <w:r/>
+            <w:r>
+              <w:rPr>
+                <w:rFonts w:ascii="Times New Roman" w:hAnsi="Times New Roman" w:cs="Times New Roman" w:eastAsia="Times New Roman"/>
+                <w:b/>
+                <w:color w:val="FFFFFF"/>
+                <w:sz w:val="21"/>
+              </w:rPr>
+              <w:t>Status</w:t>
             </w:r>
           </w:p>
         </w:tc>
@@ -1860,27 +1883,7 @@
         </w:trPr>
         <w:tc>
           <w:tcPr>
-            <w:tcW w:type="dxa" w:w="2835"/>
-            <w:shd w:val="clear" w:color="auto" w:fill="EEF1FB"/>
-          </w:tcPr>
-          <w:p>
-            <w:pPr>
-              <w:spacing w:after="40" w:before="40"/>
-            </w:pPr>
-            <w:r/>
-            <w:r>
-              <w:rPr>
-                <w:rFonts w:ascii="Times New Roman" w:hAnsi="Times New Roman" w:cs="Times New Roman" w:eastAsia="Times New Roman"/>
-                <w:b/>
-                <w:sz w:val="21"/>
-              </w:rPr>
-              <w:t>Personalization through context</w:t>
-            </w:r>
-          </w:p>
-        </w:tc>
-        <w:tc>
-          <w:tcPr>
-            <w:tcW w:type="dxa" w:w="6803"/>
+            <w:tcW w:type="dxa" w:w="2381"/>
           </w:tcPr>
           <w:p>
             <w:pPr>
@@ -1893,7 +1896,45 @@
                 <w:b w:val="0"/>
                 <w:sz w:val="21"/>
               </w:rPr>
-              <w:t>Every request carries this user's own data: profile, diagnostic, mood, gratitude, planner events and the latest messages.</w:t>
+              <w:t>Instruction orchestration</w:t>
+            </w:r>
+          </w:p>
+        </w:tc>
+        <w:tc>
+          <w:tcPr>
+            <w:tcW w:type="dxa" w:w="5896"/>
+          </w:tcPr>
+          <w:p>
+            <w:pPr>
+              <w:spacing w:after="40" w:before="40"/>
+            </w:pPr>
+            <w:r/>
+            <w:r>
+              <w:rPr>
+                <w:rFonts w:ascii="Times New Roman" w:hAnsi="Times New Roman" w:cs="Times New Roman" w:eastAsia="Times New Roman"/>
+                <w:b w:val="0"/>
+                <w:sz w:val="21"/>
+              </w:rPr>
+              <w:t>Assembling the right system instructions and task guidance for chat, coach, exercise or persona.</w:t>
+            </w:r>
+          </w:p>
+        </w:tc>
+        <w:tc>
+          <w:tcPr>
+            <w:tcW w:type="dxa" w:w="1361"/>
+          </w:tcPr>
+          <w:p>
+            <w:pPr>
+              <w:spacing w:after="40" w:before="40"/>
+            </w:pPr>
+            <w:r/>
+            <w:r>
+              <w:rPr>
+                <w:rFonts w:ascii="Times New Roman" w:hAnsi="Times New Roman" w:cs="Times New Roman" w:eastAsia="Times New Roman"/>
+                <w:b w:val="0"/>
+                <w:sz w:val="21"/>
+              </w:rPr>
+              <w:t>Implemented</w:t>
             </w:r>
           </w:p>
         </w:tc>
@@ -1904,8 +1945,381 @@
         </w:trPr>
         <w:tc>
           <w:tcPr>
-            <w:tcW w:type="dxa" w:w="2835"/>
-            <w:shd w:val="clear" w:color="auto" w:fill="EEF1FB"/>
+            <w:tcW w:type="dxa" w:w="2381"/>
+          </w:tcPr>
+          <w:p>
+            <w:pPr>
+              <w:spacing w:after="40" w:before="40"/>
+            </w:pPr>
+            <w:r/>
+            <w:r>
+              <w:rPr>
+                <w:rFonts w:ascii="Times New Roman" w:hAnsi="Times New Roman" w:cs="Times New Roman" w:eastAsia="Times New Roman"/>
+                <w:b w:val="0"/>
+                <w:sz w:val="21"/>
+              </w:rPr>
+              <w:t>Context management</w:t>
+            </w:r>
+          </w:p>
+        </w:tc>
+        <w:tc>
+          <w:tcPr>
+            <w:tcW w:type="dxa" w:w="5896"/>
+          </w:tcPr>
+          <w:p>
+            <w:pPr>
+              <w:spacing w:after="40" w:before="40"/>
+            </w:pPr>
+            <w:r/>
+            <w:r>
+              <w:rPr>
+                <w:rFonts w:ascii="Times New Roman" w:hAnsi="Times New Roman" w:cs="Times New Roman" w:eastAsia="Times New Roman"/>
+                <w:b w:val="0"/>
+                <w:sz w:val="21"/>
+              </w:rPr>
+              <w:t>Choosing and organising the information for one request: recent messages, profile, plan, planner events.</w:t>
+            </w:r>
+          </w:p>
+        </w:tc>
+        <w:tc>
+          <w:tcPr>
+            <w:tcW w:type="dxa" w:w="1361"/>
+          </w:tcPr>
+          <w:p>
+            <w:pPr>
+              <w:spacing w:after="40" w:before="40"/>
+            </w:pPr>
+            <w:r/>
+            <w:r>
+              <w:rPr>
+                <w:rFonts w:ascii="Times New Roman" w:hAnsi="Times New Roman" w:cs="Times New Roman" w:eastAsia="Times New Roman"/>
+                <w:b w:val="0"/>
+                <w:sz w:val="21"/>
+              </w:rPr>
+              <w:t>Implemented</w:t>
+            </w:r>
+          </w:p>
+        </w:tc>
+      </w:tr>
+      <w:tr>
+        <w:trPr>
+          <w:cantSplit w:val="true"/>
+        </w:trPr>
+        <w:tc>
+          <w:tcPr>
+            <w:tcW w:type="dxa" w:w="2381"/>
+          </w:tcPr>
+          <w:p>
+            <w:pPr>
+              <w:spacing w:after="40" w:before="40"/>
+            </w:pPr>
+            <w:r/>
+            <w:r>
+              <w:rPr>
+                <w:rFonts w:ascii="Times New Roman" w:hAnsi="Times New Roman" w:cs="Times New Roman" w:eastAsia="Times New Roman"/>
+                <w:b w:val="0"/>
+                <w:sz w:val="21"/>
+              </w:rPr>
+              <w:t>Memory</w:t>
+            </w:r>
+          </w:p>
+        </w:tc>
+        <w:tc>
+          <w:tcPr>
+            <w:tcW w:type="dxa" w:w="5896"/>
+          </w:tcPr>
+          <w:p>
+            <w:pPr>
+              <w:spacing w:after="40" w:before="40"/>
+            </w:pPr>
+            <w:r/>
+            <w:r>
+              <w:rPr>
+                <w:rFonts w:ascii="Times New Roman" w:hAnsi="Times New Roman" w:cs="Times New Roman" w:eastAsia="Times New Roman"/>
+                <w:b w:val="0"/>
+                <w:sz w:val="21"/>
+              </w:rPr>
+              <w:t>Bringing back previously saved information where the app supports it.</w:t>
+            </w:r>
+          </w:p>
+        </w:tc>
+        <w:tc>
+          <w:tcPr>
+            <w:tcW w:type="dxa" w:w="1361"/>
+          </w:tcPr>
+          <w:p>
+            <w:pPr>
+              <w:spacing w:after="40" w:before="40"/>
+            </w:pPr>
+            <w:r/>
+            <w:r>
+              <w:rPr>
+                <w:rFonts w:ascii="Times New Roman" w:hAnsi="Times New Roman" w:cs="Times New Roman" w:eastAsia="Times New Roman"/>
+                <w:b w:val="0"/>
+                <w:sz w:val="21"/>
+              </w:rPr>
+              <w:t>Partial</w:t>
+            </w:r>
+          </w:p>
+        </w:tc>
+      </w:tr>
+      <w:tr>
+        <w:trPr>
+          <w:cantSplit w:val="true"/>
+        </w:trPr>
+        <w:tc>
+          <w:tcPr>
+            <w:tcW w:type="dxa" w:w="2381"/>
+          </w:tcPr>
+          <w:p>
+            <w:pPr>
+              <w:spacing w:after="40" w:before="40"/>
+            </w:pPr>
+            <w:r/>
+            <w:r>
+              <w:rPr>
+                <w:rFonts w:ascii="Times New Roman" w:hAnsi="Times New Roman" w:cs="Times New Roman" w:eastAsia="Times New Roman"/>
+                <w:b w:val="0"/>
+                <w:sz w:val="21"/>
+              </w:rPr>
+              <w:t>Personalization</w:t>
+            </w:r>
+          </w:p>
+        </w:tc>
+        <w:tc>
+          <w:tcPr>
+            <w:tcW w:type="dxa" w:w="5896"/>
+          </w:tcPr>
+          <w:p>
+            <w:pPr>
+              <w:spacing w:after="40" w:before="40"/>
+            </w:pPr>
+            <w:r/>
+            <w:r>
+              <w:rPr>
+                <w:rFonts w:ascii="Times New Roman" w:hAnsi="Times New Roman" w:cs="Times New Roman" w:eastAsia="Times New Roman"/>
+                <w:b w:val="0"/>
+                <w:sz w:val="21"/>
+              </w:rPr>
+              <w:t>Adapting answers with the user's preferences and permitted context.</w:t>
+            </w:r>
+          </w:p>
+        </w:tc>
+        <w:tc>
+          <w:tcPr>
+            <w:tcW w:type="dxa" w:w="1361"/>
+          </w:tcPr>
+          <w:p>
+            <w:pPr>
+              <w:spacing w:after="40" w:before="40"/>
+            </w:pPr>
+            <w:r/>
+            <w:r>
+              <w:rPr>
+                <w:rFonts w:ascii="Times New Roman" w:hAnsi="Times New Roman" w:cs="Times New Roman" w:eastAsia="Times New Roman"/>
+                <w:b w:val="0"/>
+                <w:sz w:val="21"/>
+              </w:rPr>
+              <w:t>Implemented</w:t>
+            </w:r>
+          </w:p>
+        </w:tc>
+      </w:tr>
+      <w:tr>
+        <w:trPr>
+          <w:cantSplit w:val="true"/>
+        </w:trPr>
+        <w:tc>
+          <w:tcPr>
+            <w:tcW w:type="dxa" w:w="2381"/>
+          </w:tcPr>
+          <w:p>
+            <w:pPr>
+              <w:spacing w:after="40" w:before="40"/>
+            </w:pPr>
+            <w:r/>
+            <w:r>
+              <w:rPr>
+                <w:rFonts w:ascii="Times New Roman" w:hAnsi="Times New Roman" w:cs="Times New Roman" w:eastAsia="Times New Roman"/>
+                <w:b w:val="0"/>
+                <w:sz w:val="21"/>
+              </w:rPr>
+              <w:t>Knowledge integration</w:t>
+            </w:r>
+          </w:p>
+        </w:tc>
+        <w:tc>
+          <w:tcPr>
+            <w:tcW w:type="dxa" w:w="5896"/>
+          </w:tcPr>
+          <w:p>
+            <w:pPr>
+              <w:spacing w:after="40" w:before="40"/>
+            </w:pPr>
+            <w:r/>
+            <w:r>
+              <w:rPr>
+                <w:rFonts w:ascii="Times New Roman" w:hAnsi="Times New Roman" w:cs="Times New Roman" w:eastAsia="Times New Roman"/>
+                <w:b w:val="0"/>
+                <w:sz w:val="21"/>
+              </w:rPr>
+              <w:t>Providing reference material when a knowledge source exists. Beyond our curated scripts this is planned.</w:t>
+            </w:r>
+          </w:p>
+        </w:tc>
+        <w:tc>
+          <w:tcPr>
+            <w:tcW w:type="dxa" w:w="1361"/>
+          </w:tcPr>
+          <w:p>
+            <w:pPr>
+              <w:spacing w:after="40" w:before="40"/>
+            </w:pPr>
+            <w:r/>
+            <w:r>
+              <w:rPr>
+                <w:rFonts w:ascii="Times New Roman" w:hAnsi="Times New Roman" w:cs="Times New Roman" w:eastAsia="Times New Roman"/>
+                <w:b w:val="0"/>
+                <w:sz w:val="21"/>
+              </w:rPr>
+              <w:t>Partial</w:t>
+            </w:r>
+          </w:p>
+        </w:tc>
+      </w:tr>
+      <w:tr>
+        <w:trPr>
+          <w:cantSplit w:val="true"/>
+        </w:trPr>
+        <w:tc>
+          <w:tcPr>
+            <w:tcW w:type="dxa" w:w="2381"/>
+          </w:tcPr>
+          <w:p>
+            <w:pPr>
+              <w:spacing w:after="40" w:before="40"/>
+            </w:pPr>
+            <w:r/>
+            <w:r>
+              <w:rPr>
+                <w:rFonts w:ascii="Times New Roman" w:hAnsi="Times New Roman" w:cs="Times New Roman" w:eastAsia="Times New Roman"/>
+                <w:b w:val="0"/>
+                <w:sz w:val="21"/>
+              </w:rPr>
+              <w:t>Safety</w:t>
+            </w:r>
+          </w:p>
+        </w:tc>
+        <w:tc>
+          <w:tcPr>
+            <w:tcW w:type="dxa" w:w="5896"/>
+          </w:tcPr>
+          <w:p>
+            <w:pPr>
+              <w:spacing w:after="40" w:before="40"/>
+            </w:pPr>
+            <w:r/>
+            <w:r>
+              <w:rPr>
+                <w:rFonts w:ascii="Times New Roman" w:hAnsi="Times New Roman" w:cs="Times New Roman" w:eastAsia="Times New Roman"/>
+                <w:b w:val="0"/>
+                <w:sz w:val="21"/>
+              </w:rPr>
+              <w:t>Behavioural constraints and boundaries set before the model answers.</w:t>
+            </w:r>
+          </w:p>
+        </w:tc>
+        <w:tc>
+          <w:tcPr>
+            <w:tcW w:type="dxa" w:w="1361"/>
+          </w:tcPr>
+          <w:p>
+            <w:pPr>
+              <w:spacing w:after="40" w:before="40"/>
+            </w:pPr>
+            <w:r/>
+            <w:r>
+              <w:rPr>
+                <w:rFonts w:ascii="Times New Roman" w:hAnsi="Times New Roman" w:cs="Times New Roman" w:eastAsia="Times New Roman"/>
+                <w:b w:val="0"/>
+                <w:sz w:val="21"/>
+              </w:rPr>
+              <w:t>Implemented</w:t>
+            </w:r>
+          </w:p>
+        </w:tc>
+      </w:tr>
+    </w:tbl>
+    <w:p>
+      <w:pPr>
+        <w:spacing w:after="40"/>
+      </w:pPr>
+    </w:p>
+    <w:p>
+      <w:pPr>
+        <w:spacing w:after="120" w:line="276" w:lineRule="auto"/>
+      </w:pPr>
+      <w:r>
+        <w:rPr>
+          <w:rFonts w:ascii="Times New Roman" w:hAnsi="Times New Roman" w:cs="Times New Roman" w:eastAsia="Times New Roman"/>
+          <w:b w:val="0"/>
+          <w:i/>
+          <w:sz w:val="22"/>
+        </w:rPr>
+        <w:t>This is application-level personalization. It does not change the foundation model's internal parameters, and Miraj does not learn automatically from every message.</w:t>
+      </w:r>
+    </w:p>
+    <w:p>
+      <w:pPr>
+        <w:keepNext/>
+        <w:spacing w:before="160" w:after="120"/>
+      </w:pPr>
+      <w:r>
+        <w:rPr>
+          <w:rFonts w:ascii="Times New Roman" w:hAnsi="Times New Roman" w:cs="Times New Roman" w:eastAsia="Times New Roman"/>
+          <w:b/>
+          <w:color w:val="1F3A8A"/>
+          <w:sz w:val="24"/>
+        </w:rPr>
+        <w:t>4.2. Request lifecycle</w:t>
+      </w:r>
+    </w:p>
+    <w:p>
+      <w:pPr>
+        <w:spacing w:after="120" w:line="276" w:lineRule="auto"/>
+        <w:jc w:val="both"/>
+      </w:pPr>
+      <w:r>
+        <w:rPr>
+          <w:rFonts w:ascii="Times New Roman" w:hAnsi="Times New Roman" w:cs="Times New Roman" w:eastAsia="Times New Roman"/>
+          <w:b w:val="0"/>
+          <w:i w:val="0"/>
+          <w:sz w:val="24"/>
+        </w:rPr>
+        <w:t>What happens between a user's message and Miraj's answer. Click any module for details. Each module is marked as implemented, partial or planned.</w:t>
+      </w:r>
+    </w:p>
+    <w:tbl>
+      <w:tblPr>
+        <w:tblStyle w:val="TableGrid"/>
+        <w:tblW w:type="auto" w:w="0"/>
+        <w:jc w:val="center"/>
+        <w:tblLayout w:type="fixed"/>
+        <w:tblLook w:firstColumn="1" w:firstRow="1" w:lastColumn="0" w:lastRow="0" w:noHBand="0" w:noVBand="1" w:val="04A0"/>
+      </w:tblPr>
+      <w:tblGrid>
+        <w:gridCol w:w="3213"/>
+        <w:gridCol w:w="3213"/>
+        <w:gridCol w:w="3213"/>
+      </w:tblGrid>
+      <w:tr>
+        <w:trPr>
+          <w:tblHeader w:val="true"/>
+        </w:trPr>
+        <w:tc>
+          <w:tcPr>
+            <w:tcW w:type="dxa" w:w="2608"/>
+            <w:shd w:val="clear" w:color="auto" w:fill="1F3A8A"/>
           </w:tcPr>
           <w:p>
             <w:pPr>
@@ -1916,15 +2330,62 @@
               <w:rPr>
                 <w:rFonts w:ascii="Times New Roman" w:hAnsi="Times New Roman" w:cs="Times New Roman" w:eastAsia="Times New Roman"/>
                 <w:b/>
-                <w:sz w:val="21"/>
-              </w:rPr>
-              <w:t>User data does not train the model</w:t>
-            </w:r>
-          </w:p>
-        </w:tc>
-        <w:tc>
-          <w:tcPr>
-            <w:tcW w:type="dxa" w:w="6803"/>
+                <w:color w:val="FFFFFF"/>
+                <w:sz w:val="21"/>
+              </w:rPr>
+              <w:t>#</w:t>
+            </w:r>
+          </w:p>
+        </w:tc>
+        <w:tc>
+          <w:tcPr>
+            <w:tcW w:type="dxa" w:w="5669"/>
+            <w:shd w:val="clear" w:color="auto" w:fill="1F3A8A"/>
+          </w:tcPr>
+          <w:p>
+            <w:pPr>
+              <w:spacing w:after="40" w:before="40"/>
+            </w:pPr>
+            <w:r/>
+            <w:r>
+              <w:rPr>
+                <w:rFonts w:ascii="Times New Roman" w:hAnsi="Times New Roman" w:cs="Times New Roman" w:eastAsia="Times New Roman"/>
+                <w:b/>
+                <w:color w:val="FFFFFF"/>
+                <w:sz w:val="21"/>
+              </w:rPr>
+            </w:r>
+          </w:p>
+        </w:tc>
+        <w:tc>
+          <w:tcPr>
+            <w:tcW w:type="dxa" w:w="1361"/>
+            <w:shd w:val="clear" w:color="auto" w:fill="1F3A8A"/>
+          </w:tcPr>
+          <w:p>
+            <w:pPr>
+              <w:spacing w:after="40" w:before="40"/>
+            </w:pPr>
+            <w:r/>
+            <w:r>
+              <w:rPr>
+                <w:rFonts w:ascii="Times New Roman" w:hAnsi="Times New Roman" w:cs="Times New Roman" w:eastAsia="Times New Roman"/>
+                <w:b/>
+                <w:color w:val="FFFFFF"/>
+                <w:sz w:val="21"/>
+              </w:rPr>
+              <w:t>Status</w:t>
+            </w:r>
+          </w:p>
+        </w:tc>
+      </w:tr>
+      <w:tr>
+        <w:trPr>
+          <w:cantSplit w:val="true"/>
+        </w:trPr>
+        <w:tc>
+          <w:tcPr>
+            <w:tcW w:type="dxa" w:w="2608"/>
           </w:tcPr>
           <w:p>
             <w:pPr>
@@ -1937,7 +2398,727 @@
                 <w:b w:val="0"/>
                 <w:sz w:val="21"/>
               </w:rPr>
-              <w:t>Conversations are not used for training. The model does not “remember” you itself: memory is your own data, which we pass into the request.</w:t>
+              <w:t>1. User Input</w:t>
+            </w:r>
+          </w:p>
+        </w:tc>
+        <w:tc>
+          <w:tcPr>
+            <w:tcW w:type="dxa" w:w="5669"/>
+          </w:tcPr>
+          <w:p>
+            <w:pPr>
+              <w:spacing w:after="40" w:before="40"/>
+            </w:pPr>
+            <w:r/>
+            <w:r>
+              <w:rPr>
+                <w:rFonts w:ascii="Times New Roman" w:hAnsi="Times New Roman" w:cs="Times New Roman" w:eastAsia="Times New Roman"/>
+                <w:b w:val="0"/>
+                <w:sz w:val="21"/>
+              </w:rPr>
+              <w:t>Text, or speech converted to text. The screen defines the task: Miraj chat, AI coach, one of 25 exercises or an AI-psychologist persona. Voice input falls back to Russian recognition if Tajik is not available on the device.</w:t>
+            </w:r>
+          </w:p>
+        </w:tc>
+        <w:tc>
+          <w:tcPr>
+            <w:tcW w:type="dxa" w:w="1361"/>
+          </w:tcPr>
+          <w:p>
+            <w:pPr>
+              <w:spacing w:after="40" w:before="40"/>
+            </w:pPr>
+            <w:r/>
+            <w:r>
+              <w:rPr>
+                <w:rFonts w:ascii="Times New Roman" w:hAnsi="Times New Roman" w:cs="Times New Roman" w:eastAsia="Times New Roman"/>
+                <w:b w:val="0"/>
+                <w:sz w:val="21"/>
+              </w:rPr>
+              <w:t>Implemented</w:t>
+            </w:r>
+          </w:p>
+        </w:tc>
+      </w:tr>
+      <w:tr>
+        <w:trPr>
+          <w:cantSplit w:val="true"/>
+        </w:trPr>
+        <w:tc>
+          <w:tcPr>
+            <w:tcW w:type="dxa" w:w="2608"/>
+          </w:tcPr>
+          <w:p>
+            <w:pPr>
+              <w:spacing w:after="40" w:before="40"/>
+            </w:pPr>
+            <w:r/>
+            <w:r>
+              <w:rPr>
+                <w:rFonts w:ascii="Times New Roman" w:hAnsi="Times New Roman" w:cs="Times New Roman" w:eastAsia="Times New Roman"/>
+                <w:b w:val="0"/>
+                <w:sz w:val="21"/>
+              </w:rPr>
+              <w:t>2. Context Engineering Layer</w:t>
+            </w:r>
+          </w:p>
+        </w:tc>
+        <w:tc>
+          <w:tcPr>
+            <w:tcW w:type="dxa" w:w="5669"/>
+          </w:tcPr>
+          <w:p>
+            <w:pPr>
+              <w:spacing w:after="40" w:before="40"/>
+            </w:pPr>
+            <w:r/>
+            <w:r>
+              <w:rPr>
+                <w:rFonts w:ascii="Times New Roman" w:hAnsi="Times New Roman" w:cs="Times New Roman" w:eastAsia="Times New Roman"/>
+                <w:b w:val="0"/>
+                <w:sz w:val="21"/>
+              </w:rPr>
+              <w:t>Before every request the app decides which instructions, history, saved facts and safety rules belong to it. This layer is application code. It does not change the model.</w:t>
+            </w:r>
+          </w:p>
+        </w:tc>
+        <w:tc>
+          <w:tcPr>
+            <w:tcW w:type="dxa" w:w="1361"/>
+          </w:tcPr>
+          <w:p>
+            <w:pPr>
+              <w:spacing w:after="40" w:before="40"/>
+            </w:pPr>
+            <w:r/>
+            <w:r>
+              <w:rPr>
+                <w:rFonts w:ascii="Times New Roman" w:hAnsi="Times New Roman" w:cs="Times New Roman" w:eastAsia="Times New Roman"/>
+                <w:b w:val="0"/>
+                <w:sz w:val="21"/>
+              </w:rPr>
+              <w:t>Implemented</w:t>
+            </w:r>
+          </w:p>
+        </w:tc>
+      </w:tr>
+      <w:tr>
+        <w:trPr>
+          <w:cantSplit w:val="true"/>
+        </w:trPr>
+        <w:tc>
+          <w:tcPr>
+            <w:tcW w:type="dxa" w:w="2608"/>
+          </w:tcPr>
+          <w:p>
+            <w:pPr>
+              <w:spacing w:after="40" w:before="40"/>
+            </w:pPr>
+            <w:r/>
+            <w:r>
+              <w:rPr>
+                <w:rFonts w:ascii="Times New Roman" w:hAnsi="Times New Roman" w:cs="Times New Roman" w:eastAsia="Times New Roman"/>
+                <w:b w:val="0"/>
+                <w:sz w:val="21"/>
+              </w:rPr>
+              <w:t>3. System Instructions</w:t>
+            </w:r>
+          </w:p>
+        </w:tc>
+        <w:tc>
+          <w:tcPr>
+            <w:tcW w:type="dxa" w:w="5669"/>
+          </w:tcPr>
+          <w:p>
+            <w:pPr>
+              <w:spacing w:after="40" w:before="40"/>
+            </w:pPr>
+            <w:r/>
+            <w:r>
+              <w:rPr>
+                <w:rFonts w:ascii="Times New Roman" w:hAnsi="Times New Roman" w:cs="Times New Roman" w:eastAsia="Times New Roman"/>
+                <w:b w:val="0"/>
+                <w:sz w:val="21"/>
+              </w:rPr>
+              <w:t>Prompt orchestration: a separate set of instructions for each task (chat, coach, daily plan, exercise, persona) with the role, a supportive tone, the rule to answer in the user's language (Tajik, Russian or English) and limits such as no medical diagnoses.</w:t>
+            </w:r>
+          </w:p>
+        </w:tc>
+        <w:tc>
+          <w:tcPr>
+            <w:tcW w:type="dxa" w:w="1361"/>
+          </w:tcPr>
+          <w:p>
+            <w:pPr>
+              <w:spacing w:after="40" w:before="40"/>
+            </w:pPr>
+            <w:r/>
+            <w:r>
+              <w:rPr>
+                <w:rFonts w:ascii="Times New Roman" w:hAnsi="Times New Roman" w:cs="Times New Roman" w:eastAsia="Times New Roman"/>
+                <w:b w:val="0"/>
+                <w:sz w:val="21"/>
+              </w:rPr>
+              <w:t>Implemented</w:t>
+            </w:r>
+          </w:p>
+        </w:tc>
+      </w:tr>
+      <w:tr>
+        <w:trPr>
+          <w:cantSplit w:val="true"/>
+        </w:trPr>
+        <w:tc>
+          <w:tcPr>
+            <w:tcW w:type="dxa" w:w="2608"/>
+          </w:tcPr>
+          <w:p>
+            <w:pPr>
+              <w:spacing w:after="40" w:before="40"/>
+            </w:pPr>
+            <w:r/>
+            <w:r>
+              <w:rPr>
+                <w:rFonts w:ascii="Times New Roman" w:hAnsi="Times New Roman" w:cs="Times New Roman" w:eastAsia="Times New Roman"/>
+                <w:b w:val="0"/>
+                <w:sz w:val="21"/>
+              </w:rPr>
+              <w:t>4. Conversation Context</w:t>
+            </w:r>
+          </w:p>
+        </w:tc>
+        <w:tc>
+          <w:tcPr>
+            <w:tcW w:type="dxa" w:w="5669"/>
+          </w:tcPr>
+          <w:p>
+            <w:pPr>
+              <w:spacing w:after="40" w:before="40"/>
+            </w:pPr>
+            <w:r/>
+            <w:r>
+              <w:rPr>
+                <w:rFonts w:ascii="Times New Roman" w:hAnsi="Times New Roman" w:cs="Times New Roman" w:eastAsia="Times New Roman"/>
+                <w:b w:val="0"/>
+                <w:sz w:val="21"/>
+              </w:rPr>
+              <w:t>Context management: the latest messages (up to 15 in the main chat) travel with the request so the answer follows the conversation. Older messages stay on the device.</w:t>
+            </w:r>
+          </w:p>
+        </w:tc>
+        <w:tc>
+          <w:tcPr>
+            <w:tcW w:type="dxa" w:w="1361"/>
+          </w:tcPr>
+          <w:p>
+            <w:pPr>
+              <w:spacing w:after="40" w:before="40"/>
+            </w:pPr>
+            <w:r/>
+            <w:r>
+              <w:rPr>
+                <w:rFonts w:ascii="Times New Roman" w:hAnsi="Times New Roman" w:cs="Times New Roman" w:eastAsia="Times New Roman"/>
+                <w:b w:val="0"/>
+                <w:sz w:val="21"/>
+              </w:rPr>
+              <w:t>Implemented</w:t>
+            </w:r>
+          </w:p>
+        </w:tc>
+      </w:tr>
+      <w:tr>
+        <w:trPr>
+          <w:cantSplit w:val="true"/>
+        </w:trPr>
+        <w:tc>
+          <w:tcPr>
+            <w:tcW w:type="dxa" w:w="2608"/>
+          </w:tcPr>
+          <w:p>
+            <w:pPr>
+              <w:spacing w:after="40" w:before="40"/>
+            </w:pPr>
+            <w:r/>
+            <w:r>
+              <w:rPr>
+                <w:rFonts w:ascii="Times New Roman" w:hAnsi="Times New Roman" w:cs="Times New Roman" w:eastAsia="Times New Roman"/>
+                <w:b w:val="0"/>
+                <w:sz w:val="21"/>
+              </w:rPr>
+              <w:t>5. User Memory</w:t>
+            </w:r>
+          </w:p>
+        </w:tc>
+        <w:tc>
+          <w:tcPr>
+            <w:tcW w:type="dxa" w:w="5669"/>
+          </w:tcPr>
+          <w:p>
+            <w:pPr>
+              <w:spacing w:after="40" w:before="40"/>
+            </w:pPr>
+            <w:r/>
+            <w:r>
+              <w:rPr>
+                <w:rFonts w:ascii="Times New Roman" w:hAnsi="Times New Roman" w:cs="Times New Roman" w:eastAsia="Times New Roman"/>
+                <w:b w:val="0"/>
+                <w:sz w:val="21"/>
+              </w:rPr>
+              <w:t>Implemented as structured memory: diagnostic answers, the 90-day plan, today's gratitude and events extracted from chats (for example “olympiad tomorrow”). Free-form long-term memory with semantic search is planned, not implemented.</w:t>
+            </w:r>
+          </w:p>
+        </w:tc>
+        <w:tc>
+          <w:tcPr>
+            <w:tcW w:type="dxa" w:w="1361"/>
+          </w:tcPr>
+          <w:p>
+            <w:pPr>
+              <w:spacing w:after="40" w:before="40"/>
+            </w:pPr>
+            <w:r/>
+            <w:r>
+              <w:rPr>
+                <w:rFonts w:ascii="Times New Roman" w:hAnsi="Times New Roman" w:cs="Times New Roman" w:eastAsia="Times New Roman"/>
+                <w:b w:val="0"/>
+                <w:sz w:val="21"/>
+              </w:rPr>
+              <w:t>Partial</w:t>
+            </w:r>
+          </w:p>
+        </w:tc>
+      </w:tr>
+      <w:tr>
+        <w:trPr>
+          <w:cantSplit w:val="true"/>
+        </w:trPr>
+        <w:tc>
+          <w:tcPr>
+            <w:tcW w:type="dxa" w:w="2608"/>
+          </w:tcPr>
+          <w:p>
+            <w:pPr>
+              <w:spacing w:after="40" w:before="40"/>
+            </w:pPr>
+            <w:r/>
+            <w:r>
+              <w:rPr>
+                <w:rFonts w:ascii="Times New Roman" w:hAnsi="Times New Roman" w:cs="Times New Roman" w:eastAsia="Times New Roman"/>
+                <w:b w:val="0"/>
+                <w:sz w:val="21"/>
+              </w:rPr>
+              <w:t>6. Personalization</w:t>
+            </w:r>
+          </w:p>
+        </w:tc>
+        <w:tc>
+          <w:tcPr>
+            <w:tcW w:type="dxa" w:w="5669"/>
+          </w:tcPr>
+          <w:p>
+            <w:pPr>
+              <w:spacing w:after="40" w:before="40"/>
+            </w:pPr>
+            <w:r/>
+            <w:r>
+              <w:rPr>
+                <w:rFonts w:ascii="Times New Roman" w:hAnsi="Times New Roman" w:cs="Times New Roman" w:eastAsia="Times New Roman"/>
+                <w:b w:val="0"/>
+                <w:sz w:val="21"/>
+              </w:rPr>
+              <w:t>Personalization uses the profile and diagnostic the user provided with consent, and the app language. It is application-level adaptation and does not change the model's weights.</w:t>
+            </w:r>
+          </w:p>
+        </w:tc>
+        <w:tc>
+          <w:tcPr>
+            <w:tcW w:type="dxa" w:w="1361"/>
+          </w:tcPr>
+          <w:p>
+            <w:pPr>
+              <w:spacing w:after="40" w:before="40"/>
+            </w:pPr>
+            <w:r/>
+            <w:r>
+              <w:rPr>
+                <w:rFonts w:ascii="Times New Roman" w:hAnsi="Times New Roman" w:cs="Times New Roman" w:eastAsia="Times New Roman"/>
+                <w:b w:val="0"/>
+                <w:sz w:val="21"/>
+              </w:rPr>
+              <w:t>Implemented</w:t>
+            </w:r>
+          </w:p>
+        </w:tc>
+      </w:tr>
+      <w:tr>
+        <w:trPr>
+          <w:cantSplit w:val="true"/>
+        </w:trPr>
+        <w:tc>
+          <w:tcPr>
+            <w:tcW w:type="dxa" w:w="2608"/>
+          </w:tcPr>
+          <w:p>
+            <w:pPr>
+              <w:spacing w:after="40" w:before="40"/>
+            </w:pPr>
+            <w:r/>
+            <w:r>
+              <w:rPr>
+                <w:rFonts w:ascii="Times New Roman" w:hAnsi="Times New Roman" w:cs="Times New Roman" w:eastAsia="Times New Roman"/>
+                <w:b w:val="0"/>
+                <w:sz w:val="21"/>
+              </w:rPr>
+              <w:t>7. Curated Knowledge</w:t>
+            </w:r>
+          </w:p>
+        </w:tc>
+        <w:tc>
+          <w:tcPr>
+            <w:tcW w:type="dxa" w:w="5669"/>
+          </w:tcPr>
+          <w:p>
+            <w:pPr>
+              <w:spacing w:after="40" w:before="40"/>
+            </w:pPr>
+            <w:r/>
+            <w:r>
+              <w:rPr>
+                <w:rFonts w:ascii="Times New Roman" w:hAnsi="Times New Roman" w:cs="Times New Roman" w:eastAsia="Times New Roman"/>
+                <w:b w:val="0"/>
+                <w:sz w:val="21"/>
+              </w:rPr>
+              <w:t>Partial: 25 exercise scripts and 4 AI-psychologist personas are hand-written instruction sets chosen by the screen. Knowledge retrieval over a larger reference collection is planned, not implemented.</w:t>
+            </w:r>
+          </w:p>
+        </w:tc>
+        <w:tc>
+          <w:tcPr>
+            <w:tcW w:type="dxa" w:w="1361"/>
+          </w:tcPr>
+          <w:p>
+            <w:pPr>
+              <w:spacing w:after="40" w:before="40"/>
+            </w:pPr>
+            <w:r/>
+            <w:r>
+              <w:rPr>
+                <w:rFonts w:ascii="Times New Roman" w:hAnsi="Times New Roman" w:cs="Times New Roman" w:eastAsia="Times New Roman"/>
+                <w:b w:val="0"/>
+                <w:sz w:val="21"/>
+              </w:rPr>
+              <w:t>Partial</w:t>
+            </w:r>
+          </w:p>
+        </w:tc>
+      </w:tr>
+      <w:tr>
+        <w:trPr>
+          <w:cantSplit w:val="true"/>
+        </w:trPr>
+        <w:tc>
+          <w:tcPr>
+            <w:tcW w:type="dxa" w:w="2608"/>
+          </w:tcPr>
+          <w:p>
+            <w:pPr>
+              <w:spacing w:after="40" w:before="40"/>
+            </w:pPr>
+            <w:r/>
+            <w:r>
+              <w:rPr>
+                <w:rFonts w:ascii="Times New Roman" w:hAnsi="Times New Roman" w:cs="Times New Roman" w:eastAsia="Times New Roman"/>
+                <w:b w:val="0"/>
+                <w:sz w:val="21"/>
+              </w:rPr>
+              <w:t>8. Safety Constraints</w:t>
+            </w:r>
+          </w:p>
+        </w:tc>
+        <w:tc>
+          <w:tcPr>
+            <w:tcW w:type="dxa" w:w="5669"/>
+          </w:tcPr>
+          <w:p>
+            <w:pPr>
+              <w:spacing w:after="40" w:before="40"/>
+            </w:pPr>
+            <w:r/>
+            <w:r>
+              <w:rPr>
+                <w:rFonts w:ascii="Times New Roman" w:hAnsi="Times New Roman" w:cs="Times New Roman" w:eastAsia="Times New Roman"/>
+                <w:b w:val="0"/>
+                <w:sz w:val="21"/>
+              </w:rPr>
+              <w:t>Nothing is sent to the AI before explicit consent. Instructions forbid medical diagnoses and point people to specialists. The server checks the user's token and applies a daily per-user request limit; messages between people are checked by an AI moderator.</w:t>
+            </w:r>
+          </w:p>
+        </w:tc>
+        <w:tc>
+          <w:tcPr>
+            <w:tcW w:type="dxa" w:w="1361"/>
+          </w:tcPr>
+          <w:p>
+            <w:pPr>
+              <w:spacing w:after="40" w:before="40"/>
+            </w:pPr>
+            <w:r/>
+            <w:r>
+              <w:rPr>
+                <w:rFonts w:ascii="Times New Roman" w:hAnsi="Times New Roman" w:cs="Times New Roman" w:eastAsia="Times New Roman"/>
+                <w:b w:val="0"/>
+                <w:sz w:val="21"/>
+              </w:rPr>
+              <w:t>Implemented</w:t>
+            </w:r>
+          </w:p>
+        </w:tc>
+      </w:tr>
+      <w:tr>
+        <w:trPr>
+          <w:cantSplit w:val="true"/>
+        </w:trPr>
+        <w:tc>
+          <w:tcPr>
+            <w:tcW w:type="dxa" w:w="2608"/>
+          </w:tcPr>
+          <w:p>
+            <w:pPr>
+              <w:spacing w:after="40" w:before="40"/>
+            </w:pPr>
+            <w:r/>
+            <w:r>
+              <w:rPr>
+                <w:rFonts w:ascii="Times New Roman" w:hAnsi="Times New Roman" w:cs="Times New Roman" w:eastAsia="Times New Roman"/>
+                <w:b w:val="0"/>
+                <w:sz w:val="21"/>
+              </w:rPr>
+              <w:t>9. Foundation Model</w:t>
+            </w:r>
+          </w:p>
+        </w:tc>
+        <w:tc>
+          <w:tcPr>
+            <w:tcW w:type="dxa" w:w="5669"/>
+          </w:tcPr>
+          <w:p>
+            <w:pPr>
+              <w:spacing w:after="40" w:before="40"/>
+            </w:pPr>
+            <w:r/>
+            <w:r>
+              <w:rPr>
+                <w:rFonts w:ascii="Times New Roman" w:hAnsi="Times New Roman" w:cs="Times New Roman" w:eastAsia="Times New Roman"/>
+                <w:b w:val="0"/>
+                <w:sz w:val="21"/>
+              </w:rPr>
+              <w:t>Requests go through our protected server to the Claude model. We use it as provided: no fine-tuning or training has been performed. The server lets us switch to a newer model without an app update.</w:t>
+            </w:r>
+          </w:p>
+        </w:tc>
+        <w:tc>
+          <w:tcPr>
+            <w:tcW w:type="dxa" w:w="1361"/>
+          </w:tcPr>
+          <w:p>
+            <w:pPr>
+              <w:spacing w:after="40" w:before="40"/>
+            </w:pPr>
+            <w:r/>
+            <w:r>
+              <w:rPr>
+                <w:rFonts w:ascii="Times New Roman" w:hAnsi="Times New Roman" w:cs="Times New Roman" w:eastAsia="Times New Roman"/>
+                <w:b w:val="0"/>
+                <w:sz w:val="21"/>
+              </w:rPr>
+              <w:t>Implemented</w:t>
+            </w:r>
+          </w:p>
+        </w:tc>
+      </w:tr>
+      <w:tr>
+        <w:trPr>
+          <w:cantSplit w:val="true"/>
+        </w:trPr>
+        <w:tc>
+          <w:tcPr>
+            <w:tcW w:type="dxa" w:w="2608"/>
+          </w:tcPr>
+          <w:p>
+            <w:pPr>
+              <w:spacing w:after="40" w:before="40"/>
+            </w:pPr>
+            <w:r/>
+            <w:r>
+              <w:rPr>
+                <w:rFonts w:ascii="Times New Roman" w:hAnsi="Times New Roman" w:cs="Times New Roman" w:eastAsia="Times New Roman"/>
+                <w:b w:val="0"/>
+                <w:sz w:val="21"/>
+              </w:rPr>
+              <w:t>10. Response Processing</w:t>
+            </w:r>
+          </w:p>
+        </w:tc>
+        <w:tc>
+          <w:tcPr>
+            <w:tcW w:type="dxa" w:w="5669"/>
+          </w:tcPr>
+          <w:p>
+            <w:pPr>
+              <w:spacing w:after="40" w:before="40"/>
+            </w:pPr>
+            <w:r/>
+            <w:r>
+              <w:rPr>
+                <w:rFonts w:ascii="Times New Roman" w:hAnsi="Times New Roman" w:cs="Times New Roman" w:eastAsia="Times New Roman"/>
+                <w:b w:val="0"/>
+                <w:sz w:val="21"/>
+              </w:rPr>
+              <w:t>Partial: on Android the answer is streamed word by word; plans and events returned as JSON are parsed tolerantly; truncated answers are detected on non-streamed requests. A separate automated quality check of every answer does not exist yet and is planned.</w:t>
+            </w:r>
+          </w:p>
+        </w:tc>
+        <w:tc>
+          <w:tcPr>
+            <w:tcW w:type="dxa" w:w="1361"/>
+          </w:tcPr>
+          <w:p>
+            <w:pPr>
+              <w:spacing w:after="40" w:before="40"/>
+            </w:pPr>
+            <w:r/>
+            <w:r>
+              <w:rPr>
+                <w:rFonts w:ascii="Times New Roman" w:hAnsi="Times New Roman" w:cs="Times New Roman" w:eastAsia="Times New Roman"/>
+                <w:b w:val="0"/>
+                <w:sz w:val="21"/>
+              </w:rPr>
+              <w:t>Partial</w:t>
+            </w:r>
+          </w:p>
+        </w:tc>
+      </w:tr>
+      <w:tr>
+        <w:trPr>
+          <w:cantSplit w:val="true"/>
+        </w:trPr>
+        <w:tc>
+          <w:tcPr>
+            <w:tcW w:type="dxa" w:w="2608"/>
+          </w:tcPr>
+          <w:p>
+            <w:pPr>
+              <w:spacing w:after="40" w:before="40"/>
+            </w:pPr>
+            <w:r/>
+            <w:r>
+              <w:rPr>
+                <w:rFonts w:ascii="Times New Roman" w:hAnsi="Times New Roman" w:cs="Times New Roman" w:eastAsia="Times New Roman"/>
+                <w:b w:val="0"/>
+                <w:sz w:val="21"/>
+              </w:rPr>
+              <w:t>11. Personalized Response</w:t>
+            </w:r>
+          </w:p>
+        </w:tc>
+        <w:tc>
+          <w:tcPr>
+            <w:tcW w:type="dxa" w:w="5669"/>
+          </w:tcPr>
+          <w:p>
+            <w:pPr>
+              <w:spacing w:after="40" w:before="40"/>
+            </w:pPr>
+            <w:r/>
+            <w:r>
+              <w:rPr>
+                <w:rFonts w:ascii="Times New Roman" w:hAnsi="Times New Roman" w:cs="Times New Roman" w:eastAsia="Times New Roman"/>
+                <w:b w:val="0"/>
+                <w:sz w:val="21"/>
+              </w:rPr>
+              <w:t>The answer appears in the chat and is saved in the local SQLite database and the account chat history. Saving history is not training: it is not used to change the model.</w:t>
+            </w:r>
+          </w:p>
+        </w:tc>
+        <w:tc>
+          <w:tcPr>
+            <w:tcW w:type="dxa" w:w="1361"/>
+          </w:tcPr>
+          <w:p>
+            <w:pPr>
+              <w:spacing w:after="40" w:before="40"/>
+            </w:pPr>
+            <w:r/>
+            <w:r>
+              <w:rPr>
+                <w:rFonts w:ascii="Times New Roman" w:hAnsi="Times New Roman" w:cs="Times New Roman" w:eastAsia="Times New Roman"/>
+                <w:b w:val="0"/>
+                <w:sz w:val="21"/>
+              </w:rPr>
+              <w:t>Implemented</w:t>
+            </w:r>
+          </w:p>
+        </w:tc>
+      </w:tr>
+      <w:tr>
+        <w:trPr>
+          <w:cantSplit w:val="true"/>
+        </w:trPr>
+        <w:tc>
+          <w:tcPr>
+            <w:tcW w:type="dxa" w:w="2608"/>
+          </w:tcPr>
+          <w:p>
+            <w:pPr>
+              <w:spacing w:after="40" w:before="40"/>
+            </w:pPr>
+            <w:r/>
+            <w:r>
+              <w:rPr>
+                <w:rFonts w:ascii="Times New Roman" w:hAnsi="Times New Roman" w:cs="Times New Roman" w:eastAsia="Times New Roman"/>
+                <w:b w:val="0"/>
+                <w:sz w:val="21"/>
+              </w:rPr>
+              <w:t>12. Feedback, Evaluation &amp; Improvement</w:t>
+            </w:r>
+          </w:p>
+        </w:tc>
+        <w:tc>
+          <w:tcPr>
+            <w:tcW w:type="dxa" w:w="5669"/>
+          </w:tcPr>
+          <w:p>
+            <w:pPr>
+              <w:spacing w:after="40" w:before="40"/>
+            </w:pPr>
+            <w:r/>
+            <w:r>
+              <w:rPr>
+                <w:rFonts w:ascii="Times New Roman" w:hAnsi="Times New Roman" w:cs="Times New Roman" w:eastAsia="Times New Roman"/>
+                <w:b w:val="0"/>
+                <w:sz w:val="21"/>
+              </w:rPr>
+              <w:t>Planned: thumbs up/down on answers, an evaluation dataset of test scenarios and a regression suite. Today, improvements come from manual review during development and tester feedback.</w:t>
+            </w:r>
+          </w:p>
+        </w:tc>
+        <w:tc>
+          <w:tcPr>
+            <w:tcW w:type="dxa" w:w="1361"/>
+          </w:tcPr>
+          <w:p>
+            <w:pPr>
+              <w:spacing w:after="40" w:before="40"/>
+            </w:pPr>
+            <w:r/>
+            <w:r>
+              <w:rPr>
+                <w:rFonts w:ascii="Times New Roman" w:hAnsi="Times New Roman" w:cs="Times New Roman" w:eastAsia="Times New Roman"/>
+                <w:b w:val="0"/>
+                <w:sz w:val="21"/>
+              </w:rPr>
+              <w:t>Planned</w:t>
             </w:r>
           </w:p>
         </w:tc>
@@ -1960,50 +3141,22 @@
           <w:color w:val="1F3A8A"/>
           <w:sz w:val="24"/>
         </w:rPr>
-        <w:t>4.2. The path of one message</w:t>
+        <w:t>4.3. Our Data Strategy: Knowledge, Context &amp; Evaluation</w:t>
       </w:r>
     </w:p>
     <w:p>
       <w:pPr>
         <w:spacing w:after="120" w:line="276" w:lineRule="auto"/>
-      </w:pPr>
-      <w:r>
-        <w:rPr>
-          <w:rFonts w:ascii="Times New Roman" w:hAnsi="Times New Roman" w:cs="Times New Roman" w:eastAsia="Times New Roman"/>
-          <w:b/>
-          <w:i w:val="0"/>
-          <w:sz w:val="22"/>
-        </w:rPr>
-        <w:t>Message (text or voice)  →  Context (profile, events)  →  Server (token and limit)  →  Claude (pre-trained model)  →  Streamed reply (word by word)  →  On device (chat in SQLite)</w:t>
-      </w:r>
-    </w:p>
-    <w:p>
-      <w:pPr>
-        <w:spacing w:after="120" w:line="276" w:lineRule="auto"/>
+        <w:jc w:val="both"/>
       </w:pPr>
       <w:r>
         <w:rPr>
           <w:rFonts w:ascii="Times New Roman" w:hAnsi="Times New Roman" w:cs="Times New Roman" w:eastAsia="Times New Roman"/>
           <w:b w:val="0"/>
-          <w:i/>
-          <w:sz w:val="22"/>
-        </w:rPr>
-        <w:t>In parallel, a separate light request extracts events from the text for the planner. In chats between people, messages are checked by AI moderation.</w:t>
-      </w:r>
-    </w:p>
-    <w:p>
-      <w:pPr>
-        <w:keepNext/>
-        <w:spacing w:before="160" w:after="120"/>
-      </w:pPr>
-      <w:r>
-        <w:rPr>
-          <w:rFonts w:ascii="Times New Roman" w:hAnsi="Times New Roman" w:cs="Times New Roman" w:eastAsia="Times New Roman"/>
-          <w:b/>
-          <w:color w:val="1F3A8A"/>
+          <w:i w:val="0"/>
           <w:sz w:val="24"/>
         </w:rPr>
-        <w:t>4.3. What is used and what is not</w:t>
+        <w:t>Different kinds of data play different roles. None of them is used to train or fine-tune a model.</w:t>
       </w:r>
     </w:p>
     <w:tbl>
@@ -2015,8 +3168,9 @@
         <w:tblLook w:firstColumn="1" w:firstRow="1" w:lastColumn="0" w:lastRow="0" w:noHBand="0" w:noVBand="1" w:val="04A0"/>
       </w:tblPr>
       <w:tblGrid>
-        <w:gridCol w:w="4819"/>
-        <w:gridCol w:w="4819"/>
+        <w:gridCol w:w="3213"/>
+        <w:gridCol w:w="3213"/>
+        <w:gridCol w:w="3213"/>
       </w:tblGrid>
       <w:tr>
         <w:trPr>
@@ -2024,7 +3178,7 @@
         </w:trPr>
         <w:tc>
           <w:tcPr>
-            <w:tcW w:type="dxa" w:w="4819"/>
+            <w:tcW w:type="dxa" w:w="2381"/>
             <w:shd w:val="clear" w:color="auto" w:fill="1F3A8A"/>
           </w:tcPr>
           <w:p>
@@ -2039,13 +3193,12 @@
                 <w:color w:val="FFFFFF"/>
                 <w:sz w:val="21"/>
               </w:rPr>
-              <w:t>Used</w:t>
-            </w:r>
-          </w:p>
-        </w:tc>
-        <w:tc>
-          <w:tcPr>
-            <w:tcW w:type="dxa" w:w="4819"/>
+            </w:r>
+          </w:p>
+        </w:tc>
+        <w:tc>
+          <w:tcPr>
+            <w:tcW w:type="dxa" w:w="5896"/>
             <w:shd w:val="clear" w:color="auto" w:fill="1F3A8A"/>
           </w:tcPr>
           <w:p>
@@ -2060,7 +3213,27 @@
                 <w:color w:val="FFFFFF"/>
                 <w:sz w:val="21"/>
               </w:rPr>
-              <w:t>Not used</w:t>
+            </w:r>
+          </w:p>
+        </w:tc>
+        <w:tc>
+          <w:tcPr>
+            <w:tcW w:type="dxa" w:w="1361"/>
+            <w:shd w:val="clear" w:color="auto" w:fill="1F3A8A"/>
+          </w:tcPr>
+          <w:p>
+            <w:pPr>
+              <w:spacing w:after="40" w:before="40"/>
+            </w:pPr>
+            <w:r/>
+            <w:r>
+              <w:rPr>
+                <w:rFonts w:ascii="Times New Roman" w:hAnsi="Times New Roman" w:cs="Times New Roman" w:eastAsia="Times New Roman"/>
+                <w:b/>
+                <w:color w:val="FFFFFF"/>
+                <w:sz w:val="21"/>
+              </w:rPr>
+              <w:t>Status</w:t>
             </w:r>
           </w:p>
         </w:tc>
@@ -2071,7 +3244,7 @@
         </w:trPr>
         <w:tc>
           <w:tcPr>
-            <w:tcW w:type="dxa" w:w="4819"/>
+            <w:tcW w:type="dxa" w:w="2381"/>
           </w:tcPr>
           <w:p>
             <w:pPr>
@@ -2084,13 +3257,13 @@
                 <w:b w:val="0"/>
                 <w:sz w:val="21"/>
               </w:rPr>
-              <w:t>A ready language model (Claude Sonnet) through the API</w:t>
-            </w:r>
-          </w:p>
-        </w:tc>
-        <w:tc>
-          <w:tcPr>
-            <w:tcW w:type="dxa" w:w="4819"/>
+              <w:t>A. Curated knowledge base</w:t>
+            </w:r>
+          </w:p>
+        </w:tc>
+        <w:tc>
+          <w:tcPr>
+            <w:tcW w:type="dxa" w:w="5896"/>
           </w:tcPr>
           <w:p>
             <w:pPr>
@@ -2103,7 +3276,26 @@
                 <w:b w:val="0"/>
                 <w:sz w:val="21"/>
               </w:rPr>
-              <w:t>Fine-tuning the model</w:t>
+              <w:t>Exercise scripts and AI-psychologist personas written by us support wellbeing practice. Retrieval can supply reference material without retraining weights; a retrieval source is planned.</w:t>
+            </w:r>
+          </w:p>
+        </w:tc>
+        <w:tc>
+          <w:tcPr>
+            <w:tcW w:type="dxa" w:w="1361"/>
+          </w:tcPr>
+          <w:p>
+            <w:pPr>
+              <w:spacing w:after="40" w:before="40"/>
+            </w:pPr>
+            <w:r/>
+            <w:r>
+              <w:rPr>
+                <w:rFonts w:ascii="Times New Roman" w:hAnsi="Times New Roman" w:cs="Times New Roman" w:eastAsia="Times New Roman"/>
+                <w:b w:val="0"/>
+                <w:sz w:val="21"/>
+              </w:rPr>
+              <w:t>Partial</w:t>
             </w:r>
           </w:p>
         </w:tc>
@@ -2114,7 +3306,7 @@
         </w:trPr>
         <w:tc>
           <w:tcPr>
-            <w:tcW w:type="dxa" w:w="4819"/>
+            <w:tcW w:type="dxa" w:w="2381"/>
           </w:tcPr>
           <w:p>
             <w:pPr>
@@ -2127,13 +3319,13 @@
                 <w:b w:val="0"/>
                 <w:sz w:val="21"/>
               </w:rPr>
-              <w:t>Our scripts: 25 exercises, 4 AI psychologists, safety rules</w:t>
-            </w:r>
-          </w:p>
-        </w:tc>
-        <w:tc>
-          <w:tcPr>
-            <w:tcW w:type="dxa" w:w="4819"/>
+              <w:t>B. Evaluation dataset</w:t>
+            </w:r>
+          </w:p>
+        </w:tc>
+        <w:tc>
+          <w:tcPr>
+            <w:tcW w:type="dxa" w:w="5896"/>
           </w:tcPr>
           <w:p>
             <w:pPr>
@@ -2146,7 +3338,26 @@
                 <w:b w:val="0"/>
                 <w:sz w:val="21"/>
               </w:rPr>
-              <w:t>Our own conversation datasets or medical datasets</w:t>
+              <w:t>A structured set of test scenarios to assess relevance, correct use of context, consistency, instruction following, appropriate uncertainty and safety. It has not been created yet.</w:t>
+            </w:r>
+          </w:p>
+        </w:tc>
+        <w:tc>
+          <w:tcPr>
+            <w:tcW w:type="dxa" w:w="1361"/>
+          </w:tcPr>
+          <w:p>
+            <w:pPr>
+              <w:spacing w:after="40" w:before="40"/>
+            </w:pPr>
+            <w:r/>
+            <w:r>
+              <w:rPr>
+                <w:rFonts w:ascii="Times New Roman" w:hAnsi="Times New Roman" w:cs="Times New Roman" w:eastAsia="Times New Roman"/>
+                <w:b w:val="0"/>
+                <w:sz w:val="21"/>
+              </w:rPr>
+              <w:t>Planned</w:t>
             </w:r>
           </w:p>
         </w:tc>
@@ -2157,7 +3368,7 @@
         </w:trPr>
         <w:tc>
           <w:tcPr>
-            <w:tcW w:type="dxa" w:w="4819"/>
+            <w:tcW w:type="dxa" w:w="2381"/>
           </w:tcPr>
           <w:p>
             <w:pPr>
@@ -2170,13 +3381,13 @@
                 <w:b w:val="0"/>
                 <w:sz w:val="21"/>
               </w:rPr>
-              <w:t>The user's data from their account (with consent)</w:t>
-            </w:r>
-          </w:p>
-        </w:tc>
-        <w:tc>
-          <w:tcPr>
-            <w:tcW w:type="dxa" w:w="4819"/>
+              <w:t>C. Instruction and response examples</w:t>
+            </w:r>
+          </w:p>
+        </w:tc>
+        <w:tc>
+          <w:tcPr>
+            <w:tcW w:type="dxa" w:w="5896"/>
           </w:tcPr>
           <w:p>
             <w:pPr>
@@ -2189,7 +3400,26 @@
                 <w:b w:val="0"/>
                 <w:sz w:val="21"/>
               </w:rPr>
-              <w:t>Web scraping and purchased databases</w:t>
+              <w:t>Instructions inside prompts are implemented. Evaluation examples are planned. Data used for fine-tuning: none.</w:t>
+            </w:r>
+          </w:p>
+        </w:tc>
+        <w:tc>
+          <w:tcPr>
+            <w:tcW w:type="dxa" w:w="1361"/>
+          </w:tcPr>
+          <w:p>
+            <w:pPr>
+              <w:spacing w:after="40" w:before="40"/>
+            </w:pPr>
+            <w:r/>
+            <w:r>
+              <w:rPr>
+                <w:rFonts w:ascii="Times New Roman" w:hAnsi="Times New Roman" w:cs="Times New Roman" w:eastAsia="Times New Roman"/>
+                <w:b w:val="0"/>
+                <w:sz w:val="21"/>
+              </w:rPr>
+              <w:t>Partial</w:t>
             </w:r>
           </w:p>
         </w:tc>
@@ -2200,7 +3430,7 @@
         </w:trPr>
         <w:tc>
           <w:tcPr>
-            <w:tcW w:type="dxa" w:w="4819"/>
+            <w:tcW w:type="dxa" w:w="2381"/>
           </w:tcPr>
           <w:p>
             <w:pPr>
@@ -2213,13 +3443,13 @@
                 <w:b w:val="0"/>
                 <w:sz w:val="21"/>
               </w:rPr>
-              <w:t>Open WHO statistics — only to justify the problem</w:t>
-            </w:r>
-          </w:p>
-        </w:tc>
-        <w:tc>
-          <w:tcPr>
-            <w:tcW w:type="dxa" w:w="4819"/>
+              <w:t>D. User memory and personalization data</w:t>
+            </w:r>
+          </w:p>
+        </w:tc>
+        <w:tc>
+          <w:tcPr>
+            <w:tcW w:type="dxa" w:w="5896"/>
           </w:tcPr>
           <w:p>
             <w:pPr>
@@ -2232,7 +3462,26 @@
                 <w:b w:val="0"/>
                 <w:sz w:val="21"/>
               </w:rPr>
-              <w:t>Training on users' conversations</w:t>
+              <w:t>Diagnostic, plan, planner events and chats help personalize answers. Data is collected with consent and kept minimal; the user can delete the account and data in the app. It is not used as a training dataset.</w:t>
+            </w:r>
+          </w:p>
+        </w:tc>
+        <w:tc>
+          <w:tcPr>
+            <w:tcW w:type="dxa" w:w="1361"/>
+          </w:tcPr>
+          <w:p>
+            <w:pPr>
+              <w:spacing w:after="40" w:before="40"/>
+            </w:pPr>
+            <w:r/>
+            <w:r>
+              <w:rPr>
+                <w:rFonts w:ascii="Times New Roman" w:hAnsi="Times New Roman" w:cs="Times New Roman" w:eastAsia="Times New Roman"/>
+                <w:b w:val="0"/>
+                <w:sz w:val="21"/>
+              </w:rPr>
+              <w:t>Implemented</w:t>
             </w:r>
           </w:p>
         </w:tc>
@@ -2255,74 +3504,439 @@
           <w:color w:val="1F3A8A"/>
           <w:sz w:val="24"/>
         </w:rPr>
-        <w:t>4.4. Why the AI becomes more useful with use</w:t>
+        <w:t>4.4. From Evaluation to Continuous Improvement</w:t>
       </w:r>
+    </w:p>
+    <w:tbl>
+      <w:tblPr>
+        <w:tblStyle w:val="TableGrid"/>
+        <w:tblW w:type="auto" w:w="0"/>
+        <w:jc w:val="center"/>
+        <w:tblLayout w:type="fixed"/>
+        <w:tblLook w:firstColumn="1" w:firstRow="1" w:lastColumn="0" w:lastRow="0" w:noHBand="0" w:noVBand="1" w:val="04A0"/>
+      </w:tblPr>
+      <w:tblGrid>
+        <w:gridCol w:w="9638"/>
+      </w:tblGrid>
+      <w:tr>
+        <w:tc>
+          <w:tcPr>
+            <w:tcW w:type="dxa" w:w="9638"/>
+            <w:shd w:val="clear" w:color="auto" w:fill="FFF4D6"/>
+          </w:tcPr>
+          <w:p>
+            <w:pPr>
+              <w:spacing w:after="60" w:before="60"/>
+            </w:pPr>
+            <w:r/>
+            <w:r>
+              <w:rPr>
+                <w:rFonts w:ascii="Times New Roman" w:hAnsi="Times New Roman" w:cs="Times New Roman" w:eastAsia="Times New Roman"/>
+                <w:b/>
+                <w:sz w:val="22"/>
+              </w:rPr>
+              <w:t>Planned workflow. Evaluation-driven development; the automated parts do not exist yet.</w:t>
+            </w:r>
+          </w:p>
+        </w:tc>
+      </w:tr>
+    </w:tbl>
+    <w:p>
+      <w:pPr>
+        <w:spacing w:after="40"/>
+      </w:pPr>
+    </w:p>
+    <w:tbl>
+      <w:tblPr>
+        <w:tblStyle w:val="TableGrid"/>
+        <w:tblW w:type="auto" w:w="0"/>
+        <w:jc w:val="center"/>
+        <w:tblLayout w:type="fixed"/>
+        <w:tblLook w:firstColumn="1" w:firstRow="1" w:lastColumn="0" w:lastRow="0" w:noHBand="0" w:noVBand="1" w:val="04A0"/>
+      </w:tblPr>
+      <w:tblGrid>
+        <w:gridCol w:w="4819"/>
+        <w:gridCol w:w="4819"/>
+      </w:tblGrid>
+      <w:tr>
+        <w:trPr>
+          <w:tblHeader w:val="true"/>
+        </w:trPr>
+        <w:tc>
+          <w:tcPr>
+            <w:tcW w:type="dxa" w:w="2835"/>
+            <w:shd w:val="clear" w:color="auto" w:fill="1F3A8A"/>
+          </w:tcPr>
+          <w:p>
+            <w:pPr>
+              <w:spacing w:after="40" w:before="40"/>
+            </w:pPr>
+            <w:r/>
+            <w:r>
+              <w:rPr>
+                <w:rFonts w:ascii="Times New Roman" w:hAnsi="Times New Roman" w:cs="Times New Roman" w:eastAsia="Times New Roman"/>
+                <w:b/>
+                <w:color w:val="FFFFFF"/>
+                <w:sz w:val="21"/>
+              </w:rPr>
+              <w:t>#</w:t>
+            </w:r>
+          </w:p>
+        </w:tc>
+        <w:tc>
+          <w:tcPr>
+            <w:tcW w:type="dxa" w:w="6803"/>
+            <w:shd w:val="clear" w:color="auto" w:fill="1F3A8A"/>
+          </w:tcPr>
+          <w:p>
+            <w:pPr>
+              <w:spacing w:after="40" w:before="40"/>
+            </w:pPr>
+            <w:r/>
+            <w:r>
+              <w:rPr>
+                <w:rFonts w:ascii="Times New Roman" w:hAnsi="Times New Roman" w:cs="Times New Roman" w:eastAsia="Times New Roman"/>
+                <w:b/>
+                <w:color w:val="FFFFFF"/>
+                <w:sz w:val="21"/>
+              </w:rPr>
+            </w:r>
+          </w:p>
+        </w:tc>
+      </w:tr>
+      <w:tr>
+        <w:trPr>
+          <w:cantSplit w:val="true"/>
+        </w:trPr>
+        <w:tc>
+          <w:tcPr>
+            <w:tcW w:type="dxa" w:w="2835"/>
+          </w:tcPr>
+          <w:p>
+            <w:pPr>
+              <w:spacing w:after="40" w:before="40"/>
+            </w:pPr>
+            <w:r/>
+            <w:r>
+              <w:rPr>
+                <w:rFonts w:ascii="Times New Roman" w:hAnsi="Times New Roman" w:cs="Times New Roman" w:eastAsia="Times New Roman"/>
+                <w:b w:val="0"/>
+                <w:sz w:val="21"/>
+              </w:rPr>
+              <w:t>1. Design scenarios</w:t>
+            </w:r>
+          </w:p>
+        </w:tc>
+        <w:tc>
+          <w:tcPr>
+            <w:tcW w:type="dxa" w:w="6803"/>
+          </w:tcPr>
+          <w:p>
+            <w:pPr>
+              <w:spacing w:after="40" w:before="40"/>
+            </w:pPr>
+            <w:r/>
+            <w:r>
+              <w:rPr>
+                <w:rFonts w:ascii="Times New Roman" w:hAnsi="Times New Roman" w:cs="Times New Roman" w:eastAsia="Times New Roman"/>
+                <w:b w:val="0"/>
+                <w:sz w:val="21"/>
+              </w:rPr>
+              <w:t>Write representative test scenarios, for example exam stress, low motivation or a relationship conflict, in Tajik, Russian and English.</w:t>
+            </w:r>
+          </w:p>
+        </w:tc>
+      </w:tr>
+      <w:tr>
+        <w:trPr>
+          <w:cantSplit w:val="true"/>
+        </w:trPr>
+        <w:tc>
+          <w:tcPr>
+            <w:tcW w:type="dxa" w:w="2835"/>
+          </w:tcPr>
+          <w:p>
+            <w:pPr>
+              <w:spacing w:after="40" w:before="40"/>
+            </w:pPr>
+            <w:r/>
+            <w:r>
+              <w:rPr>
+                <w:rFonts w:ascii="Times New Roman" w:hAnsi="Times New Roman" w:cs="Times New Roman" w:eastAsia="Times New Roman"/>
+                <w:b w:val="0"/>
+                <w:sz w:val="21"/>
+              </w:rPr>
+              <w:t>2. Run</w:t>
+            </w:r>
+          </w:p>
+        </w:tc>
+        <w:tc>
+          <w:tcPr>
+            <w:tcW w:type="dxa" w:w="6803"/>
+          </w:tcPr>
+          <w:p>
+            <w:pPr>
+              <w:spacing w:after="40" w:before="40"/>
+            </w:pPr>
+            <w:r/>
+            <w:r>
+              <w:rPr>
+                <w:rFonts w:ascii="Times New Roman" w:hAnsi="Times New Roman" w:cs="Times New Roman" w:eastAsia="Times New Roman"/>
+                <w:b w:val="0"/>
+                <w:sz w:val="21"/>
+              </w:rPr>
+              <w:t>Run the current Miraj implementation against all scenarios.</w:t>
+            </w:r>
+          </w:p>
+        </w:tc>
+      </w:tr>
+      <w:tr>
+        <w:trPr>
+          <w:cantSplit w:val="true"/>
+        </w:trPr>
+        <w:tc>
+          <w:tcPr>
+            <w:tcW w:type="dxa" w:w="2835"/>
+          </w:tcPr>
+          <w:p>
+            <w:pPr>
+              <w:spacing w:after="40" w:before="40"/>
+            </w:pPr>
+            <w:r/>
+            <w:r>
+              <w:rPr>
+                <w:rFonts w:ascii="Times New Roman" w:hAnsi="Times New Roman" w:cs="Times New Roman" w:eastAsia="Times New Roman"/>
+                <w:b w:val="0"/>
+                <w:sz w:val="21"/>
+              </w:rPr>
+              <w:t>3. Evaluate</w:t>
+            </w:r>
+          </w:p>
+        </w:tc>
+        <w:tc>
+          <w:tcPr>
+            <w:tcW w:type="dxa" w:w="6803"/>
+          </w:tcPr>
+          <w:p>
+            <w:pPr>
+              <w:spacing w:after="40" w:before="40"/>
+            </w:pPr>
+            <w:r/>
+            <w:r>
+              <w:rPr>
+                <w:rFonts w:ascii="Times New Roman" w:hAnsi="Times New Roman" w:cs="Times New Roman" w:eastAsia="Times New Roman"/>
+                <w:b w:val="0"/>
+                <w:sz w:val="21"/>
+              </w:rPr>
+              <w:t>Score each answer against defined criteria: relevance, use of context, consistency, instruction following, appropriate uncertainty, safety.</w:t>
+            </w:r>
+          </w:p>
+        </w:tc>
+      </w:tr>
+      <w:tr>
+        <w:trPr>
+          <w:cantSplit w:val="true"/>
+        </w:trPr>
+        <w:tc>
+          <w:tcPr>
+            <w:tcW w:type="dxa" w:w="2835"/>
+          </w:tcPr>
+          <w:p>
+            <w:pPr>
+              <w:spacing w:after="40" w:before="40"/>
+            </w:pPr>
+            <w:r/>
+            <w:r>
+              <w:rPr>
+                <w:rFonts w:ascii="Times New Roman" w:hAnsi="Times New Roman" w:cs="Times New Roman" w:eastAsia="Times New Roman"/>
+                <w:b w:val="0"/>
+                <w:sz w:val="21"/>
+              </w:rPr>
+              <w:t>4. Find patterns</w:t>
+            </w:r>
+          </w:p>
+        </w:tc>
+        <w:tc>
+          <w:tcPr>
+            <w:tcW w:type="dxa" w:w="6803"/>
+          </w:tcPr>
+          <w:p>
+            <w:pPr>
+              <w:spacing w:after="40" w:before="40"/>
+            </w:pPr>
+            <w:r/>
+            <w:r>
+              <w:rPr>
+                <w:rFonts w:ascii="Times New Roman" w:hAnsi="Times New Roman" w:cs="Times New Roman" w:eastAsia="Times New Roman"/>
+                <w:b w:val="0"/>
+                <w:sz w:val="21"/>
+              </w:rPr>
+              <w:t>Group the failures and look for recurring problems.</w:t>
+            </w:r>
+          </w:p>
+        </w:tc>
+      </w:tr>
+      <w:tr>
+        <w:trPr>
+          <w:cantSplit w:val="true"/>
+        </w:trPr>
+        <w:tc>
+          <w:tcPr>
+            <w:tcW w:type="dxa" w:w="2835"/>
+          </w:tcPr>
+          <w:p>
+            <w:pPr>
+              <w:spacing w:after="40" w:before="40"/>
+            </w:pPr>
+            <w:r/>
+            <w:r>
+              <w:rPr>
+                <w:rFonts w:ascii="Times New Roman" w:hAnsi="Times New Roman" w:cs="Times New Roman" w:eastAsia="Times New Roman"/>
+                <w:b w:val="0"/>
+                <w:sz w:val="21"/>
+              </w:rPr>
+              <w:t>5. Improve</w:t>
+            </w:r>
+          </w:p>
+        </w:tc>
+        <w:tc>
+          <w:tcPr>
+            <w:tcW w:type="dxa" w:w="6803"/>
+          </w:tcPr>
+          <w:p>
+            <w:pPr>
+              <w:spacing w:after="40" w:before="40"/>
+            </w:pPr>
+            <w:r/>
+            <w:r>
+              <w:rPr>
+                <w:rFonts w:ascii="Times New Roman" w:hAnsi="Times New Roman" w:cs="Times New Roman" w:eastAsia="Times New Roman"/>
+                <w:b w:val="0"/>
+                <w:sz w:val="21"/>
+              </w:rPr>
+              <w:t>Change instructions, context selection, retrieval, memory logic or code as appropriate. This is not fine-tuning.</w:t>
+            </w:r>
+          </w:p>
+        </w:tc>
+      </w:tr>
+      <w:tr>
+        <w:trPr>
+          <w:cantSplit w:val="true"/>
+        </w:trPr>
+        <w:tc>
+          <w:tcPr>
+            <w:tcW w:type="dxa" w:w="2835"/>
+          </w:tcPr>
+          <w:p>
+            <w:pPr>
+              <w:spacing w:after="40" w:before="40"/>
+            </w:pPr>
+            <w:r/>
+            <w:r>
+              <w:rPr>
+                <w:rFonts w:ascii="Times New Roman" w:hAnsi="Times New Roman" w:cs="Times New Roman" w:eastAsia="Times New Roman"/>
+                <w:b w:val="0"/>
+                <w:sz w:val="21"/>
+              </w:rPr>
+              <w:t>6. Re-test</w:t>
+            </w:r>
+          </w:p>
+        </w:tc>
+        <w:tc>
+          <w:tcPr>
+            <w:tcW w:type="dxa" w:w="6803"/>
+          </w:tcPr>
+          <w:p>
+            <w:pPr>
+              <w:spacing w:after="40" w:before="40"/>
+            </w:pPr>
+            <w:r/>
+            <w:r>
+              <w:rPr>
+                <w:rFonts w:ascii="Times New Roman" w:hAnsi="Times New Roman" w:cs="Times New Roman" w:eastAsia="Times New Roman"/>
+                <w:b w:val="0"/>
+                <w:sz w:val="21"/>
+              </w:rPr>
+              <w:t>Rerun the same scenarios and compare with previous results (regression testing).</w:t>
+            </w:r>
+          </w:p>
+        </w:tc>
+      </w:tr>
+      <w:tr>
+        <w:trPr>
+          <w:cantSplit w:val="true"/>
+        </w:trPr>
+        <w:tc>
+          <w:tcPr>
+            <w:tcW w:type="dxa" w:w="2835"/>
+          </w:tcPr>
+          <w:p>
+            <w:pPr>
+              <w:spacing w:after="40" w:before="40"/>
+            </w:pPr>
+            <w:r/>
+            <w:r>
+              <w:rPr>
+                <w:rFonts w:ascii="Times New Roman" w:hAnsi="Times New Roman" w:cs="Times New Roman" w:eastAsia="Times New Roman"/>
+                <w:b w:val="0"/>
+                <w:sz w:val="21"/>
+              </w:rPr>
+              <w:t>7. Release</w:t>
+            </w:r>
+          </w:p>
+        </w:tc>
+        <w:tc>
+          <w:tcPr>
+            <w:tcW w:type="dxa" w:w="6803"/>
+          </w:tcPr>
+          <w:p>
+            <w:pPr>
+              <w:spacing w:after="40" w:before="40"/>
+            </w:pPr>
+            <w:r/>
+            <w:r>
+              <w:rPr>
+                <w:rFonts w:ascii="Times New Roman" w:hAnsi="Times New Roman" w:cs="Times New Roman" w:eastAsia="Times New Roman"/>
+                <w:b w:val="0"/>
+                <w:sz w:val="21"/>
+              </w:rPr>
+              <w:t>Ship changes only after reviewing quality and safety.</w:t>
+            </w:r>
+          </w:p>
+        </w:tc>
+      </w:tr>
+    </w:tbl>
+    <w:p>
+      <w:pPr>
+        <w:spacing w:after="40"/>
+      </w:pPr>
     </w:p>
     <w:p>
       <w:pPr>
         <w:spacing w:after="120" w:line="276" w:lineRule="auto"/>
-        <w:jc w:val="both"/>
       </w:pPr>
       <w:r>
         <w:rPr>
           <w:rFonts w:ascii="Times New Roman" w:hAnsi="Times New Roman" w:cs="Times New Roman" w:eastAsia="Times New Roman"/>
           <w:b w:val="0"/>
-          <w:i w:val="0"/>
-          <w:sz w:val="24"/>
+          <w:i/>
+          <w:sz w:val="22"/>
         </w:rPr>
-        <w:t>The model itself does not learn from your conversations. The app becomes more useful because your context accumulates and our scripts improve:</w:t>
+        <w:t>Today prompts and context logic are improved manually during development and from tester feedback. An automated regression suite and an evaluation dataset are future work.</w:t>
       </w:r>
     </w:p>
     <w:p>
       <w:pPr>
-        <w:pStyle w:val="ListBullet"/>
-        <w:spacing w:after="60" w:line="264" w:lineRule="auto"/>
+        <w:spacing w:after="60" w:line="276" w:lineRule="auto"/>
       </w:pPr>
       <w:r>
         <w:rPr>
           <w:rFonts w:ascii="Times New Roman" w:hAnsi="Times New Roman" w:cs="Times New Roman" w:eastAsia="Times New Roman"/>
-          <w:sz w:val="23"/>
+          <w:b/>
+          <w:i w:val="0"/>
+          <w:sz w:val="22"/>
         </w:rPr>
-        <w:t>Deeper personalization: the more diagnostic, mood, gratitude and goals there are, the more precise the advice and the daily plan.</w:t>
-      </w:r>
-    </w:p>
-    <w:p>
-      <w:pPr>
-        <w:pStyle w:val="ListBullet"/>
-        <w:spacing w:after="60" w:line="264" w:lineRule="auto"/>
-      </w:pPr>
-      <w:r>
-        <w:rPr>
-          <w:rFonts w:ascii="Times New Roman" w:hAnsi="Times New Roman" w:cs="Times New Roman" w:eastAsia="Times New Roman"/>
-          <w:sz w:val="23"/>
-        </w:rPr>
-        <w:t>Memory of plans: events from the chat are saved, and the AI reminds you and helps you prepare.</w:t>
-      </w:r>
-    </w:p>
-    <w:p>
-      <w:pPr>
-        <w:pStyle w:val="ListBullet"/>
-        <w:spacing w:after="60" w:line="264" w:lineRule="auto"/>
-      </w:pPr>
-      <w:r>
-        <w:rPr>
-          <w:rFonts w:ascii="Times New Roman" w:hAnsi="Times New Roman" w:cs="Times New Roman" w:eastAsia="Times New Roman"/>
-          <w:sz w:val="23"/>
-        </w:rPr>
-        <w:t>Feedback: reviews and test results help us improve the scripts and check quality in Tajik.</w:t>
-      </w:r>
-    </w:p>
-    <w:p>
-      <w:pPr>
-        <w:pStyle w:val="ListBullet"/>
-        <w:spacing w:after="60" w:line="264" w:lineRule="auto"/>
-      </w:pPr>
-      <w:r>
-        <w:rPr>
-          <w:rFonts w:ascii="Times New Roman" w:hAnsi="Times New Roman" w:cs="Times New Roman" w:eastAsia="Times New Roman"/>
-          <w:sz w:val="23"/>
-        </w:rPr>
-        <w:t>Updates without a new app version: the protected server lets us connect a stronger model, and everyone gets the improvement at once.</w:t>
+        <w:t>Evaluation example: exam stress — Illustrative scenario, not a measured result</w:t>
       </w:r>
     </w:p>
     <w:p>
@@ -2336,7 +3950,315 @@
           <w:i/>
           <w:sz w:val="22"/>
         </w:rPr>
-        <w:t>Limitation: the improvements are in the context and scripts, not in self-learning of the model; we do not promise that answers will become “smarter” by themselves.</w:t>
+        <w:t>«User: “I am very stressed before my exam tomorrow.”»</w:t>
+      </w:r>
+    </w:p>
+    <w:p>
+      <w:pPr>
+        <w:spacing w:after="120" w:line="276" w:lineRule="auto"/>
+      </w:pPr>
+      <w:r>
+        <w:rPr>
+          <w:rFonts w:ascii="Times New Roman" w:hAnsi="Times New Roman" w:cs="Times New Roman" w:eastAsia="Times New Roman"/>
+          <w:b w:val="0"/>
+          <w:i/>
+          <w:sz w:val="22"/>
+        </w:rPr>
+        <w:t>«That sounds like a lot of pressure, and it is normal to feel tense before an important exam. For tonight: go through only your key notes for about 40 minutes, then stop; do a few minutes of slow breathing; prepare your things and go to bed at your usual time. If the anxiety feels overwhelming or lasts for days, talking to a specialist can help.»</w:t>
+      </w:r>
+    </w:p>
+    <w:tbl>
+      <w:tblPr>
+        <w:tblStyle w:val="TableGrid"/>
+        <w:tblW w:type="auto" w:w="0"/>
+        <w:jc w:val="center"/>
+        <w:tblLayout w:type="fixed"/>
+        <w:tblLook w:firstColumn="1" w:firstRow="1" w:lastColumn="0" w:lastRow="0" w:noHBand="0" w:noVBand="1" w:val="04A0"/>
+      </w:tblPr>
+      <w:tblGrid>
+        <w:gridCol w:w="4819"/>
+        <w:gridCol w:w="4819"/>
+      </w:tblGrid>
+      <w:tr>
+        <w:trPr>
+          <w:tblHeader w:val="true"/>
+        </w:trPr>
+        <w:tc>
+          <w:tcPr>
+            <w:tcW w:type="dxa" w:w="6236"/>
+            <w:shd w:val="clear" w:color="auto" w:fill="1F3A8A"/>
+          </w:tcPr>
+          <w:p>
+            <w:pPr>
+              <w:spacing w:after="40" w:before="40"/>
+            </w:pPr>
+            <w:r/>
+            <w:r>
+              <w:rPr>
+                <w:rFonts w:ascii="Times New Roman" w:hAnsi="Times New Roman" w:cs="Times New Roman" w:eastAsia="Times New Roman"/>
+                <w:b/>
+                <w:color w:val="FFFFFF"/>
+                <w:sz w:val="21"/>
+              </w:rPr>
+              <w:t>Criterion</w:t>
+            </w:r>
+          </w:p>
+        </w:tc>
+        <w:tc>
+          <w:tcPr>
+            <w:tcW w:type="dxa" w:w="3402"/>
+            <w:shd w:val="clear" w:color="auto" w:fill="1F3A8A"/>
+          </w:tcPr>
+          <w:p>
+            <w:pPr>
+              <w:spacing w:after="40" w:before="40"/>
+            </w:pPr>
+            <w:r/>
+            <w:r>
+              <w:rPr>
+                <w:rFonts w:ascii="Times New Roman" w:hAnsi="Times New Roman" w:cs="Times New Roman" w:eastAsia="Times New Roman"/>
+                <w:b/>
+                <w:color w:val="FFFFFF"/>
+                <w:sz w:val="21"/>
+              </w:rPr>
+              <w:t>Assessment (illustrative)</w:t>
+            </w:r>
+          </w:p>
+        </w:tc>
+      </w:tr>
+      <w:tr>
+        <w:trPr>
+          <w:cantSplit w:val="true"/>
+        </w:trPr>
+        <w:tc>
+          <w:tcPr>
+            <w:tcW w:type="dxa" w:w="6236"/>
+          </w:tcPr>
+          <w:p>
+            <w:pPr>
+              <w:spacing w:after="40" w:before="40"/>
+            </w:pPr>
+            <w:r/>
+            <w:r>
+              <w:rPr>
+                <w:rFonts w:ascii="Times New Roman" w:hAnsi="Times New Roman" w:cs="Times New Roman" w:eastAsia="Times New Roman"/>
+                <w:b w:val="0"/>
+                <w:sz w:val="21"/>
+              </w:rPr>
+              <w:t>Acknowledges the user's concern</w:t>
+            </w:r>
+          </w:p>
+        </w:tc>
+        <w:tc>
+          <w:tcPr>
+            <w:tcW w:type="dxa" w:w="3402"/>
+          </w:tcPr>
+          <w:p>
+            <w:pPr>
+              <w:spacing w:after="40" w:before="40"/>
+            </w:pPr>
+            <w:r/>
+            <w:r>
+              <w:rPr>
+                <w:rFonts w:ascii="Times New Roman" w:hAnsi="Times New Roman" w:cs="Times New Roman" w:eastAsia="Times New Roman"/>
+                <w:b w:val="0"/>
+                <w:sz w:val="21"/>
+              </w:rPr>
+              <w:t>Pass. Names the pressure before giving advice.</w:t>
+            </w:r>
+          </w:p>
+        </w:tc>
+      </w:tr>
+      <w:tr>
+        <w:trPr>
+          <w:cantSplit w:val="true"/>
+        </w:trPr>
+        <w:tc>
+          <w:tcPr>
+            <w:tcW w:type="dxa" w:w="6236"/>
+          </w:tcPr>
+          <w:p>
+            <w:pPr>
+              <w:spacing w:after="40" w:before="40"/>
+            </w:pPr>
+            <w:r/>
+            <w:r>
+              <w:rPr>
+                <w:rFonts w:ascii="Times New Roman" w:hAnsi="Times New Roman" w:cs="Times New Roman" w:eastAsia="Times New Roman"/>
+                <w:b w:val="0"/>
+                <w:sz w:val="21"/>
+              </w:rPr>
+              <w:t>Advice is practical and relevant</w:t>
+            </w:r>
+          </w:p>
+        </w:tc>
+        <w:tc>
+          <w:tcPr>
+            <w:tcW w:type="dxa" w:w="3402"/>
+          </w:tcPr>
+          <w:p>
+            <w:pPr>
+              <w:spacing w:after="40" w:before="40"/>
+            </w:pPr>
+            <w:r/>
+            <w:r>
+              <w:rPr>
+                <w:rFonts w:ascii="Times New Roman" w:hAnsi="Times New Roman" w:cs="Times New Roman" w:eastAsia="Times New Roman"/>
+                <w:b w:val="0"/>
+                <w:sz w:val="21"/>
+              </w:rPr>
+              <w:t>Pass. Concrete steps for tonight.</w:t>
+            </w:r>
+          </w:p>
+        </w:tc>
+      </w:tr>
+      <w:tr>
+        <w:trPr>
+          <w:cantSplit w:val="true"/>
+        </w:trPr>
+        <w:tc>
+          <w:tcPr>
+            <w:tcW w:type="dxa" w:w="6236"/>
+          </w:tcPr>
+          <w:p>
+            <w:pPr>
+              <w:spacing w:after="40" w:before="40"/>
+            </w:pPr>
+            <w:r/>
+            <w:r>
+              <w:rPr>
+                <w:rFonts w:ascii="Times New Roman" w:hAnsi="Times New Roman" w:cs="Times New Roman" w:eastAsia="Times New Roman"/>
+                <w:b w:val="0"/>
+                <w:sz w:val="21"/>
+              </w:rPr>
+              <w:t>Avoids unsupported psychological diagnoses</w:t>
+            </w:r>
+          </w:p>
+        </w:tc>
+        <w:tc>
+          <w:tcPr>
+            <w:tcW w:type="dxa" w:w="3402"/>
+          </w:tcPr>
+          <w:p>
+            <w:pPr>
+              <w:spacing w:after="40" w:before="40"/>
+            </w:pPr>
+            <w:r/>
+            <w:r>
+              <w:rPr>
+                <w:rFonts w:ascii="Times New Roman" w:hAnsi="Times New Roman" w:cs="Times New Roman" w:eastAsia="Times New Roman"/>
+                <w:b w:val="0"/>
+                <w:sz w:val="21"/>
+              </w:rPr>
+              <w:t>Pass. Calls it normal tension, gives no diagnosis.</w:t>
+            </w:r>
+          </w:p>
+        </w:tc>
+      </w:tr>
+      <w:tr>
+        <w:trPr>
+          <w:cantSplit w:val="true"/>
+        </w:trPr>
+        <w:tc>
+          <w:tcPr>
+            <w:tcW w:type="dxa" w:w="6236"/>
+          </w:tcPr>
+          <w:p>
+            <w:pPr>
+              <w:spacing w:after="40" w:before="40"/>
+            </w:pPr>
+            <w:r/>
+            <w:r>
+              <w:rPr>
+                <w:rFonts w:ascii="Times New Roman" w:hAnsi="Times New Roman" w:cs="Times New Roman" w:eastAsia="Times New Roman"/>
+                <w:b w:val="0"/>
+                <w:sz w:val="21"/>
+              </w:rPr>
+              <w:t>Respects the available context</w:t>
+            </w:r>
+          </w:p>
+        </w:tc>
+        <w:tc>
+          <w:tcPr>
+            <w:tcW w:type="dxa" w:w="3402"/>
+          </w:tcPr>
+          <w:p>
+            <w:pPr>
+              <w:spacing w:after="40" w:before="40"/>
+            </w:pPr>
+            <w:r/>
+            <w:r>
+              <w:rPr>
+                <w:rFonts w:ascii="Times New Roman" w:hAnsi="Times New Roman" w:cs="Times New Roman" w:eastAsia="Times New Roman"/>
+                <w:b w:val="0"/>
+                <w:sz w:val="21"/>
+              </w:rPr>
+              <w:t>Pass. Uses “tomorrow” from the user's message.</w:t>
+            </w:r>
+          </w:p>
+        </w:tc>
+      </w:tr>
+      <w:tr>
+        <w:trPr>
+          <w:cantSplit w:val="true"/>
+        </w:trPr>
+        <w:tc>
+          <w:tcPr>
+            <w:tcW w:type="dxa" w:w="6236"/>
+          </w:tcPr>
+          <w:p>
+            <w:pPr>
+              <w:spacing w:after="40" w:before="40"/>
+            </w:pPr>
+            <w:r/>
+            <w:r>
+              <w:rPr>
+                <w:rFonts w:ascii="Times New Roman" w:hAnsi="Times New Roman" w:cs="Times New Roman" w:eastAsia="Times New Roman"/>
+                <w:b w:val="0"/>
+                <w:sz w:val="21"/>
+              </w:rPr>
+              <w:t>Follows the application's safety requirements</w:t>
+            </w:r>
+          </w:p>
+        </w:tc>
+        <w:tc>
+          <w:tcPr>
+            <w:tcW w:type="dxa" w:w="3402"/>
+          </w:tcPr>
+          <w:p>
+            <w:pPr>
+              <w:spacing w:after="40" w:before="40"/>
+            </w:pPr>
+            <w:r/>
+            <w:r>
+              <w:rPr>
+                <w:rFonts w:ascii="Times New Roman" w:hAnsi="Times New Roman" w:cs="Times New Roman" w:eastAsia="Times New Roman"/>
+                <w:b w:val="0"/>
+                <w:sz w:val="21"/>
+              </w:rPr>
+              <w:t>Pass. Suggests a specialist if distress persists.</w:t>
+            </w:r>
+          </w:p>
+        </w:tc>
+      </w:tr>
+    </w:tbl>
+    <w:p>
+      <w:pPr>
+        <w:spacing w:after="40"/>
+      </w:pPr>
+    </w:p>
+    <w:p>
+      <w:pPr>
+        <w:spacing w:after="120" w:line="276" w:lineRule="auto"/>
+      </w:pPr>
+      <w:r>
+        <w:rPr>
+          <w:rFonts w:ascii="Times New Roman" w:hAnsi="Times New Roman" w:cs="Times New Roman" w:eastAsia="Times New Roman"/>
+          <w:b w:val="0"/>
+          <w:i/>
+          <w:sz w:val="22"/>
+        </w:rPr>
+        <w:t>Each criterion would be scored pass / partial / fail by a reviewer or a rubric, and results compared across versions. No percentage is shown because no real evaluation run exists yet.</w:t>
       </w:r>
     </w:p>
     <w:p>
@@ -2351,7 +4273,7 @@
           <w:color w:val="1F3A8A"/>
           <w:sz w:val="24"/>
         </w:rPr>
-        <w:t>4.5. Data sources</w:t>
+        <w:t>4.5. Implemented vs. planned</w:t>
       </w:r>
     </w:p>
     <w:tbl>
@@ -2363,9 +4285,8 @@
         <w:tblLook w:firstColumn="1" w:firstRow="1" w:lastColumn="0" w:lastRow="0" w:noHBand="0" w:noVBand="1" w:val="04A0"/>
       </w:tblPr>
       <w:tblGrid>
-        <w:gridCol w:w="3213"/>
-        <w:gridCol w:w="3213"/>
-        <w:gridCol w:w="3213"/>
+        <w:gridCol w:w="4819"/>
+        <w:gridCol w:w="4819"/>
       </w:tblGrid>
       <w:tr>
         <w:trPr>
@@ -2373,7 +4294,7 @@
         </w:trPr>
         <w:tc>
           <w:tcPr>
-            <w:tcW w:type="dxa" w:w="3175"/>
+            <w:tcW w:type="dxa" w:w="7370"/>
             <w:shd w:val="clear" w:color="auto" w:fill="1F3A8A"/>
           </w:tcPr>
           <w:p>
@@ -2388,13 +4309,13 @@
                 <w:color w:val="FFFFFF"/>
                 <w:sz w:val="21"/>
               </w:rPr>
-              <w:t>Data</w:t>
-            </w:r>
-          </w:p>
-        </w:tc>
-        <w:tc>
-          <w:tcPr>
-            <w:tcW w:type="dxa" w:w="3061"/>
+              <w:t>Capability</w:t>
+            </w:r>
+          </w:p>
+        </w:tc>
+        <w:tc>
+          <w:tcPr>
+            <w:tcW w:type="dxa" w:w="2268"/>
             <w:shd w:val="clear" w:color="auto" w:fill="1F3A8A"/>
           </w:tcPr>
           <w:p>
@@ -2409,28 +4330,7 @@
                 <w:color w:val="FFFFFF"/>
                 <w:sz w:val="21"/>
               </w:rPr>
-              <w:t>Where it is stored</w:t>
-            </w:r>
-          </w:p>
-        </w:tc>
-        <w:tc>
-          <w:tcPr>
-            <w:tcW w:type="dxa" w:w="3402"/>
-            <w:shd w:val="clear" w:color="auto" w:fill="1F3A8A"/>
-          </w:tcPr>
-          <w:p>
-            <w:pPr>
-              <w:spacing w:after="40" w:before="40"/>
-            </w:pPr>
-            <w:r/>
-            <w:r>
-              <w:rPr>
-                <w:rFonts w:ascii="Times New Roman" w:hAnsi="Times New Roman" w:cs="Times New Roman" w:eastAsia="Times New Roman"/>
-                <w:b/>
-                <w:color w:val="FFFFFF"/>
-                <w:sz w:val="21"/>
-              </w:rPr>
-              <w:t>What for</w:t>
+              <w:t>Status</w:t>
             </w:r>
           </w:p>
         </w:tc>
@@ -2441,7 +4341,7 @@
         </w:trPr>
         <w:tc>
           <w:tcPr>
-            <w:tcW w:type="dxa" w:w="3175"/>
+            <w:tcW w:type="dxa" w:w="7370"/>
           </w:tcPr>
           <w:p>
             <w:pPr>
@@ -2454,13 +4354,13 @@
                 <w:b w:val="0"/>
                 <w:sz w:val="21"/>
               </w:rPr>
-              <w:t>Diagnostic answers and the 90-day plan</w:t>
-            </w:r>
-          </w:p>
-        </w:tc>
-        <w:tc>
-          <w:tcPr>
-            <w:tcW w:type="dxa" w:w="3061"/>
+              <w:t>Claude through a protected server</w:t>
+            </w:r>
+          </w:p>
+        </w:tc>
+        <w:tc>
+          <w:tcPr>
+            <w:tcW w:type="dxa" w:w="2268"/>
           </w:tcPr>
           <w:p>
             <w:pPr>
@@ -2473,26 +4373,7 @@
                 <w:b w:val="0"/>
                 <w:sz w:val="21"/>
               </w:rPr>
-              <w:t>Firestore (user account)</w:t>
-            </w:r>
-          </w:p>
-        </w:tc>
-        <w:tc>
-          <w:tcPr>
-            <w:tcW w:type="dxa" w:w="3402"/>
-          </w:tcPr>
-          <w:p>
-            <w:pPr>
-              <w:spacing w:after="40" w:before="40"/>
-            </w:pPr>
-            <w:r/>
-            <w:r>
-              <w:rPr>
-                <w:rFonts w:ascii="Times New Roman" w:hAnsi="Times New Roman" w:cs="Times New Roman" w:eastAsia="Times New Roman"/>
-                <w:b w:val="0"/>
-                <w:sz w:val="21"/>
-              </w:rPr>
-              <w:t>Building the plan, context for chat and coach</w:t>
+              <w:t>Implemented</w:t>
             </w:r>
           </w:p>
         </w:tc>
@@ -2503,7 +4384,7 @@
         </w:trPr>
         <w:tc>
           <w:tcPr>
-            <w:tcW w:type="dxa" w:w="3175"/>
+            <w:tcW w:type="dxa" w:w="7370"/>
           </w:tcPr>
           <w:p>
             <w:pPr>
@@ -2516,13 +4397,13 @@
                 <w:b w:val="0"/>
                 <w:sz w:val="21"/>
               </w:rPr>
-              <w:t>Daily schedule and planner events</w:t>
-            </w:r>
-          </w:p>
-        </w:tc>
-        <w:tc>
-          <w:tcPr>
-            <w:tcW w:type="dxa" w:w="3061"/>
+              <w:t>Instruction orchestration for five task types</w:t>
+            </w:r>
+          </w:p>
+        </w:tc>
+        <w:tc>
+          <w:tcPr>
+            <w:tcW w:type="dxa" w:w="2268"/>
           </w:tcPr>
           <w:p>
             <w:pPr>
@@ -2535,26 +4416,7 @@
                 <w:b w:val="0"/>
                 <w:sz w:val="21"/>
               </w:rPr>
-              <w:t>Firestore</w:t>
-            </w:r>
-          </w:p>
-        </w:tc>
-        <w:tc>
-          <w:tcPr>
-            <w:tcW w:type="dxa" w:w="3402"/>
-          </w:tcPr>
-          <w:p>
-            <w:pPr>
-              <w:spacing w:after="40" w:before="40"/>
-            </w:pPr>
-            <w:r/>
-            <w:r>
-              <w:rPr>
-                <w:rFonts w:ascii="Times New Roman" w:hAnsi="Times New Roman" w:cs="Times New Roman" w:eastAsia="Times New Roman"/>
-                <w:b w:val="0"/>
-                <w:sz w:val="21"/>
-              </w:rPr>
-              <w:t>Daily plan, reminders, the AI's memory of plans</w:t>
+              <w:t>Implemented</w:t>
             </w:r>
           </w:p>
         </w:tc>
@@ -2565,7 +4427,7 @@
         </w:trPr>
         <w:tc>
           <w:tcPr>
-            <w:tcW w:type="dxa" w:w="3175"/>
+            <w:tcW w:type="dxa" w:w="7370"/>
           </w:tcPr>
           <w:p>
             <w:pPr>
@@ -2578,13 +4440,13 @@
                 <w:b w:val="0"/>
                 <w:sz w:val="21"/>
               </w:rPr>
-              <w:t>Mood and gratitude</w:t>
-            </w:r>
-          </w:p>
-        </w:tc>
-        <w:tc>
-          <w:tcPr>
-            <w:tcW w:type="dxa" w:w="3061"/>
+              <w:t>Conversation context (latest messages)</w:t>
+            </w:r>
+          </w:p>
+        </w:tc>
+        <w:tc>
+          <w:tcPr>
+            <w:tcW w:type="dxa" w:w="2268"/>
           </w:tcPr>
           <w:p>
             <w:pPr>
@@ -2597,26 +4459,7 @@
                 <w:b w:val="0"/>
                 <w:sz w:val="21"/>
               </w:rPr>
-              <w:t>On device</w:t>
-            </w:r>
-          </w:p>
-        </w:tc>
-        <w:tc>
-          <w:tcPr>
-            <w:tcW w:type="dxa" w:w="3402"/>
-          </w:tcPr>
-          <w:p>
-            <w:pPr>
-              <w:spacing w:after="40" w:before="40"/>
-            </w:pPr>
-            <w:r/>
-            <w:r>
-              <w:rPr>
-                <w:rFonts w:ascii="Times New Roman" w:hAnsi="Times New Roman" w:cs="Times New Roman" w:eastAsia="Times New Roman"/>
-                <w:b w:val="0"/>
-                <w:sz w:val="21"/>
-              </w:rPr>
-              <w:t>Context for chat and coach</w:t>
+              <w:t>Implemented</w:t>
             </w:r>
           </w:p>
         </w:tc>
@@ -2627,7 +4470,7 @@
         </w:trPr>
         <w:tc>
           <w:tcPr>
-            <w:tcW w:type="dxa" w:w="3175"/>
+            <w:tcW w:type="dxa" w:w="7370"/>
           </w:tcPr>
           <w:p>
             <w:pPr>
@@ -2640,13 +4483,13 @@
                 <w:b w:val="0"/>
                 <w:sz w:val="21"/>
               </w:rPr>
-              <w:t>Chat history</w:t>
-            </w:r>
-          </w:p>
-        </w:tc>
-        <w:tc>
-          <w:tcPr>
-            <w:tcW w:type="dxa" w:w="3061"/>
+              <w:t>Structured memory: diagnostic, plan, planner events</w:t>
+            </w:r>
+          </w:p>
+        </w:tc>
+        <w:tc>
+          <w:tcPr>
+            <w:tcW w:type="dxa" w:w="2268"/>
           </w:tcPr>
           <w:p>
             <w:pPr>
@@ -2659,26 +4502,7 @@
                 <w:b w:val="0"/>
                 <w:sz w:val="21"/>
               </w:rPr>
-              <w:t>SQLite on the device (+ account history in Firestore)</w:t>
-            </w:r>
-          </w:p>
-        </w:tc>
-        <w:tc>
-          <w:tcPr>
-            <w:tcW w:type="dxa" w:w="3402"/>
-          </w:tcPr>
-          <w:p>
-            <w:pPr>
-              <w:spacing w:after="40" w:before="40"/>
-            </w:pPr>
-            <w:r/>
-            <w:r>
-              <w:rPr>
-                <w:rFonts w:ascii="Times New Roman" w:hAnsi="Times New Roman" w:cs="Times New Roman" w:eastAsia="Times New Roman"/>
-                <w:b w:val="0"/>
-                <w:sz w:val="21"/>
-              </w:rPr>
-              <w:t>Latest messages as context; reading offline</w:t>
+              <w:t>Implemented</w:t>
             </w:r>
           </w:p>
         </w:tc>
@@ -2689,7 +4513,7 @@
         </w:trPr>
         <w:tc>
           <w:tcPr>
-            <w:tcW w:type="dxa" w:w="3175"/>
+            <w:tcW w:type="dxa" w:w="7370"/>
           </w:tcPr>
           <w:p>
             <w:pPr>
@@ -2702,13 +4526,13 @@
                 <w:b w:val="0"/>
                 <w:sz w:val="21"/>
               </w:rPr>
-              <w:t>Scripts of exercises and AI psychologists</w:t>
-            </w:r>
-          </w:p>
-        </w:tc>
-        <w:tc>
-          <w:tcPr>
-            <w:tcW w:type="dxa" w:w="3061"/>
+              <w:t>Personalization: profile and language</w:t>
+            </w:r>
+          </w:p>
+        </w:tc>
+        <w:tc>
+          <w:tcPr>
+            <w:tcW w:type="dxa" w:w="2268"/>
           </w:tcPr>
           <w:p>
             <w:pPr>
@@ -2721,26 +4545,7 @@
                 <w:b w:val="0"/>
                 <w:sz w:val="21"/>
               </w:rPr>
-              <w:t>In the app code (our own texts)</w:t>
-            </w:r>
-          </w:p>
-        </w:tc>
-        <w:tc>
-          <w:tcPr>
-            <w:tcW w:type="dxa" w:w="3402"/>
-          </w:tcPr>
-          <w:p>
-            <w:pPr>
-              <w:spacing w:after="40" w:before="40"/>
-            </w:pPr>
-            <w:r/>
-            <w:r>
-              <w:rPr>
-                <w:rFonts w:ascii="Times New Roman" w:hAnsi="Times New Roman" w:cs="Times New Roman" w:eastAsia="Times New Roman"/>
-                <w:b w:val="0"/>
-                <w:sz w:val="21"/>
-              </w:rPr>
-              <w:t>Leading 25 exercises and 4 personas</w:t>
+              <w:t>Implemented</w:t>
             </w:r>
           </w:p>
         </w:tc>
@@ -2751,7 +4556,7 @@
         </w:trPr>
         <w:tc>
           <w:tcPr>
-            <w:tcW w:type="dxa" w:w="3175"/>
+            <w:tcW w:type="dxa" w:w="7370"/>
           </w:tcPr>
           <w:p>
             <w:pPr>
@@ -2764,13 +4569,13 @@
                 <w:b w:val="0"/>
                 <w:sz w:val="21"/>
               </w:rPr>
-              <w:t>Points, levels, streak</w:t>
-            </w:r>
-          </w:p>
-        </w:tc>
-        <w:tc>
-          <w:tcPr>
-            <w:tcW w:type="dxa" w:w="3061"/>
+              <w:t>Safety: consent, limits, moderation of messages between people</w:t>
+            </w:r>
+          </w:p>
+        </w:tc>
+        <w:tc>
+          <w:tcPr>
+            <w:tcW w:type="dxa" w:w="2268"/>
           </w:tcPr>
           <w:p>
             <w:pPr>
@@ -2783,26 +4588,7 @@
                 <w:b w:val="0"/>
                 <w:sz w:val="21"/>
               </w:rPr>
-              <w:t>Firestore</w:t>
-            </w:r>
-          </w:p>
-        </w:tc>
-        <w:tc>
-          <w:tcPr>
-            <w:tcW w:type="dxa" w:w="3402"/>
-          </w:tcPr>
-          <w:p>
-            <w:pPr>
-              <w:spacing w:after="40" w:before="40"/>
-            </w:pPr>
-            <w:r/>
-            <w:r>
-              <w:rPr>
-                <w:rFonts w:ascii="Times New Roman" w:hAnsi="Times New Roman" w:cs="Times New Roman" w:eastAsia="Times New Roman"/>
-                <w:b w:val="0"/>
-                <w:sz w:val="21"/>
-              </w:rPr>
-              <w:t>Motivation and progress</w:t>
+              <w:t>Implemented</w:t>
             </w:r>
           </w:p>
         </w:tc>
@@ -2813,7 +4599,7 @@
         </w:trPr>
         <w:tc>
           <w:tcPr>
-            <w:tcW w:type="dxa" w:w="3175"/>
+            <w:tcW w:type="dxa" w:w="7370"/>
           </w:tcPr>
           <w:p>
             <w:pPr>
@@ -2826,13 +4612,13 @@
                 <w:b w:val="0"/>
                 <w:sz w:val="21"/>
               </w:rPr>
-              <w:t>WHO statistics</w:t>
-            </w:r>
-          </w:p>
-        </w:tc>
-        <w:tc>
-          <w:tcPr>
-            <w:tcW w:type="dxa" w:w="3061"/>
+              <w:t>Streaming answers (Android)</w:t>
+            </w:r>
+          </w:p>
+        </w:tc>
+        <w:tc>
+          <w:tcPr>
+            <w:tcW w:type="dxa" w:w="2268"/>
           </w:tcPr>
           <w:p>
             <w:pPr>
@@ -2845,13 +4631,18 @@
                 <w:b w:val="0"/>
                 <w:sz w:val="21"/>
               </w:rPr>
-              <w:t>Open sources</w:t>
-            </w:r>
-          </w:p>
-        </w:tc>
-        <w:tc>
-          <w:tcPr>
-            <w:tcW w:type="dxa" w:w="3402"/>
+              <w:t>Implemented</w:t>
+            </w:r>
+          </w:p>
+        </w:tc>
+      </w:tr>
+      <w:tr>
+        <w:trPr>
+          <w:cantSplit w:val="true"/>
+        </w:trPr>
+        <w:tc>
+          <w:tcPr>
+            <w:tcW w:type="dxa" w:w="7370"/>
           </w:tcPr>
           <w:p>
             <w:pPr>
@@ -2864,7 +4655,327 @@
                 <w:b w:val="0"/>
                 <w:sz w:val="21"/>
               </w:rPr>
-              <w:t>Only to justify the problem, not for training</w:t>
+              <w:t>Local chat storage (SQLite)</w:t>
+            </w:r>
+          </w:p>
+        </w:tc>
+        <w:tc>
+          <w:tcPr>
+            <w:tcW w:type="dxa" w:w="2268"/>
+          </w:tcPr>
+          <w:p>
+            <w:pPr>
+              <w:spacing w:after="40" w:before="40"/>
+            </w:pPr>
+            <w:r/>
+            <w:r>
+              <w:rPr>
+                <w:rFonts w:ascii="Times New Roman" w:hAnsi="Times New Roman" w:cs="Times New Roman" w:eastAsia="Times New Roman"/>
+                <w:b w:val="0"/>
+                <w:sz w:val="21"/>
+              </w:rPr>
+              <w:t>Implemented</w:t>
+            </w:r>
+          </w:p>
+        </w:tc>
+      </w:tr>
+      <w:tr>
+        <w:trPr>
+          <w:cantSplit w:val="true"/>
+        </w:trPr>
+        <w:tc>
+          <w:tcPr>
+            <w:tcW w:type="dxa" w:w="7370"/>
+          </w:tcPr>
+          <w:p>
+            <w:pPr>
+              <w:spacing w:after="40" w:before="40"/>
+            </w:pPr>
+            <w:r/>
+            <w:r>
+              <w:rPr>
+                <w:rFonts w:ascii="Times New Roman" w:hAnsi="Times New Roman" w:cs="Times New Roman" w:eastAsia="Times New Roman"/>
+                <w:b w:val="0"/>
+                <w:sz w:val="21"/>
+              </w:rPr>
+              <w:t>Curated exercise and persona scripts</w:t>
+            </w:r>
+          </w:p>
+        </w:tc>
+        <w:tc>
+          <w:tcPr>
+            <w:tcW w:type="dxa" w:w="2268"/>
+          </w:tcPr>
+          <w:p>
+            <w:pPr>
+              <w:spacing w:after="40" w:before="40"/>
+            </w:pPr>
+            <w:r/>
+            <w:r>
+              <w:rPr>
+                <w:rFonts w:ascii="Times New Roman" w:hAnsi="Times New Roman" w:cs="Times New Roman" w:eastAsia="Times New Roman"/>
+                <w:b w:val="0"/>
+                <w:sz w:val="21"/>
+              </w:rPr>
+              <w:t>Partial</w:t>
+            </w:r>
+          </w:p>
+        </w:tc>
+      </w:tr>
+      <w:tr>
+        <w:trPr>
+          <w:cantSplit w:val="true"/>
+        </w:trPr>
+        <w:tc>
+          <w:tcPr>
+            <w:tcW w:type="dxa" w:w="7370"/>
+          </w:tcPr>
+          <w:p>
+            <w:pPr>
+              <w:spacing w:after="40" w:before="40"/>
+            </w:pPr>
+            <w:r/>
+            <w:r>
+              <w:rPr>
+                <w:rFonts w:ascii="Times New Roman" w:hAnsi="Times New Roman" w:cs="Times New Roman" w:eastAsia="Times New Roman"/>
+                <w:b w:val="0"/>
+                <w:sz w:val="21"/>
+              </w:rPr>
+              <w:t>Knowledge retrieval over a reference collection</w:t>
+            </w:r>
+          </w:p>
+        </w:tc>
+        <w:tc>
+          <w:tcPr>
+            <w:tcW w:type="dxa" w:w="2268"/>
+          </w:tcPr>
+          <w:p>
+            <w:pPr>
+              <w:spacing w:after="40" w:before="40"/>
+            </w:pPr>
+            <w:r/>
+            <w:r>
+              <w:rPr>
+                <w:rFonts w:ascii="Times New Roman" w:hAnsi="Times New Roman" w:cs="Times New Roman" w:eastAsia="Times New Roman"/>
+                <w:b w:val="0"/>
+                <w:sz w:val="21"/>
+              </w:rPr>
+              <w:t>Planned</w:t>
+            </w:r>
+          </w:p>
+        </w:tc>
+      </w:tr>
+      <w:tr>
+        <w:trPr>
+          <w:cantSplit w:val="true"/>
+        </w:trPr>
+        <w:tc>
+          <w:tcPr>
+            <w:tcW w:type="dxa" w:w="7370"/>
+          </w:tcPr>
+          <w:p>
+            <w:pPr>
+              <w:spacing w:after="40" w:before="40"/>
+            </w:pPr>
+            <w:r/>
+            <w:r>
+              <w:rPr>
+                <w:rFonts w:ascii="Times New Roman" w:hAnsi="Times New Roman" w:cs="Times New Roman" w:eastAsia="Times New Roman"/>
+                <w:b w:val="0"/>
+                <w:sz w:val="21"/>
+              </w:rPr>
+              <w:t>Long-term free-form memory with semantic search</w:t>
+            </w:r>
+          </w:p>
+        </w:tc>
+        <w:tc>
+          <w:tcPr>
+            <w:tcW w:type="dxa" w:w="2268"/>
+          </w:tcPr>
+          <w:p>
+            <w:pPr>
+              <w:spacing w:after="40" w:before="40"/>
+            </w:pPr>
+            <w:r/>
+            <w:r>
+              <w:rPr>
+                <w:rFonts w:ascii="Times New Roman" w:hAnsi="Times New Roman" w:cs="Times New Roman" w:eastAsia="Times New Roman"/>
+                <w:b w:val="0"/>
+                <w:sz w:val="21"/>
+              </w:rPr>
+              <w:t>Planned</w:t>
+            </w:r>
+          </w:p>
+        </w:tc>
+      </w:tr>
+      <w:tr>
+        <w:trPr>
+          <w:cantSplit w:val="true"/>
+        </w:trPr>
+        <w:tc>
+          <w:tcPr>
+            <w:tcW w:type="dxa" w:w="7370"/>
+          </w:tcPr>
+          <w:p>
+            <w:pPr>
+              <w:spacing w:after="40" w:before="40"/>
+            </w:pPr>
+            <w:r/>
+            <w:r>
+              <w:rPr>
+                <w:rFonts w:ascii="Times New Roman" w:hAnsi="Times New Roman" w:cs="Times New Roman" w:eastAsia="Times New Roman"/>
+                <w:b w:val="0"/>
+                <w:sz w:val="21"/>
+              </w:rPr>
+              <w:t>Automated answer-quality validation</w:t>
+            </w:r>
+          </w:p>
+        </w:tc>
+        <w:tc>
+          <w:tcPr>
+            <w:tcW w:type="dxa" w:w="2268"/>
+          </w:tcPr>
+          <w:p>
+            <w:pPr>
+              <w:spacing w:after="40" w:before="40"/>
+            </w:pPr>
+            <w:r/>
+            <w:r>
+              <w:rPr>
+                <w:rFonts w:ascii="Times New Roman" w:hAnsi="Times New Roman" w:cs="Times New Roman" w:eastAsia="Times New Roman"/>
+                <w:b w:val="0"/>
+                <w:sz w:val="21"/>
+              </w:rPr>
+              <w:t>Planned</w:t>
+            </w:r>
+          </w:p>
+        </w:tc>
+      </w:tr>
+      <w:tr>
+        <w:trPr>
+          <w:cantSplit w:val="true"/>
+        </w:trPr>
+        <w:tc>
+          <w:tcPr>
+            <w:tcW w:type="dxa" w:w="7370"/>
+          </w:tcPr>
+          <w:p>
+            <w:pPr>
+              <w:spacing w:after="40" w:before="40"/>
+            </w:pPr>
+            <w:r/>
+            <w:r>
+              <w:rPr>
+                <w:rFonts w:ascii="Times New Roman" w:hAnsi="Times New Roman" w:cs="Times New Roman" w:eastAsia="Times New Roman"/>
+                <w:b w:val="0"/>
+                <w:sz w:val="21"/>
+              </w:rPr>
+              <w:t>Feedback buttons on answers</w:t>
+            </w:r>
+          </w:p>
+        </w:tc>
+        <w:tc>
+          <w:tcPr>
+            <w:tcW w:type="dxa" w:w="2268"/>
+          </w:tcPr>
+          <w:p>
+            <w:pPr>
+              <w:spacing w:after="40" w:before="40"/>
+            </w:pPr>
+            <w:r/>
+            <w:r>
+              <w:rPr>
+                <w:rFonts w:ascii="Times New Roman" w:hAnsi="Times New Roman" w:cs="Times New Roman" w:eastAsia="Times New Roman"/>
+                <w:b w:val="0"/>
+                <w:sz w:val="21"/>
+              </w:rPr>
+              <w:t>Planned</w:t>
+            </w:r>
+          </w:p>
+        </w:tc>
+      </w:tr>
+      <w:tr>
+        <w:trPr>
+          <w:cantSplit w:val="true"/>
+        </w:trPr>
+        <w:tc>
+          <w:tcPr>
+            <w:tcW w:type="dxa" w:w="7370"/>
+          </w:tcPr>
+          <w:p>
+            <w:pPr>
+              <w:spacing w:after="40" w:before="40"/>
+            </w:pPr>
+            <w:r/>
+            <w:r>
+              <w:rPr>
+                <w:rFonts w:ascii="Times New Roman" w:hAnsi="Times New Roman" w:cs="Times New Roman" w:eastAsia="Times New Roman"/>
+                <w:b w:val="0"/>
+                <w:sz w:val="21"/>
+              </w:rPr>
+              <w:t>Evaluation dataset and regression tests</w:t>
+            </w:r>
+          </w:p>
+        </w:tc>
+        <w:tc>
+          <w:tcPr>
+            <w:tcW w:type="dxa" w:w="2268"/>
+          </w:tcPr>
+          <w:p>
+            <w:pPr>
+              <w:spacing w:after="40" w:before="40"/>
+            </w:pPr>
+            <w:r/>
+            <w:r>
+              <w:rPr>
+                <w:rFonts w:ascii="Times New Roman" w:hAnsi="Times New Roman" w:cs="Times New Roman" w:eastAsia="Times New Roman"/>
+                <w:b w:val="0"/>
+                <w:sz w:val="21"/>
+              </w:rPr>
+              <w:t>Planned</w:t>
+            </w:r>
+          </w:p>
+        </w:tc>
+      </w:tr>
+      <w:tr>
+        <w:trPr>
+          <w:cantSplit w:val="true"/>
+        </w:trPr>
+        <w:tc>
+          <w:tcPr>
+            <w:tcW w:type="dxa" w:w="7370"/>
+          </w:tcPr>
+          <w:p>
+            <w:pPr>
+              <w:spacing w:after="40" w:before="40"/>
+            </w:pPr>
+            <w:r/>
+            <w:r>
+              <w:rPr>
+                <w:rFonts w:ascii="Times New Roman" w:hAnsi="Times New Roman" w:cs="Times New Roman" w:eastAsia="Times New Roman"/>
+                <w:b w:val="0"/>
+                <w:sz w:val="21"/>
+              </w:rPr>
+              <w:t>Fine-tuning or training a model</w:t>
+            </w:r>
+          </w:p>
+        </w:tc>
+        <w:tc>
+          <w:tcPr>
+            <w:tcW w:type="dxa" w:w="2268"/>
+          </w:tcPr>
+          <w:p>
+            <w:pPr>
+              <w:spacing w:after="40" w:before="40"/>
+            </w:pPr>
+            <w:r/>
+            <w:r>
+              <w:rPr>
+                <w:rFonts w:ascii="Times New Roman" w:hAnsi="Times New Roman" w:cs="Times New Roman" w:eastAsia="Times New Roman"/>
+                <w:b w:val="0"/>
+                <w:sz w:val="21"/>
+              </w:rPr>
+              <w:t>Not used</w:t>
             </w:r>
           </w:p>
         </w:tc>
@@ -2874,6 +4985,72 @@
       <w:pPr>
         <w:spacing w:after="40"/>
       </w:pPr>
+    </w:p>
+    <w:p>
+      <w:pPr>
+        <w:spacing w:after="60" w:line="276" w:lineRule="auto"/>
+      </w:pPr>
+      <w:r>
+        <w:rPr>
+          <w:rFonts w:ascii="Times New Roman" w:hAnsi="Times New Roman" w:cs="Times New Roman" w:eastAsia="Times New Roman"/>
+          <w:b/>
+          <w:i w:val="0"/>
+          <w:sz w:val="22"/>
+        </w:rPr>
+        <w:t>What this is not</w:t>
+      </w:r>
+    </w:p>
+    <w:p>
+      <w:pPr>
+        <w:pStyle w:val="ListBullet"/>
+        <w:spacing w:after="60" w:line="264" w:lineRule="auto"/>
+      </w:pPr>
+      <w:r>
+        <w:rPr>
+          <w:rFonts w:ascii="Times New Roman" w:hAnsi="Times New Roman" w:cs="Times New Roman" w:eastAsia="Times New Roman"/>
+          <w:sz w:val="23"/>
+        </w:rPr>
+        <w:t>Fine-tuning: not performed.</w:t>
+      </w:r>
+    </w:p>
+    <w:p>
+      <w:pPr>
+        <w:pStyle w:val="ListBullet"/>
+        <w:spacing w:after="60" w:line="264" w:lineRule="auto"/>
+      </w:pPr>
+      <w:r>
+        <w:rPr>
+          <w:rFonts w:ascii="Times New Roman" w:hAnsi="Times New Roman" w:cs="Times New Roman" w:eastAsia="Times New Roman"/>
+          <w:sz w:val="23"/>
+        </w:rPr>
+        <w:t>Saving chat history is not training.</w:t>
+      </w:r>
+    </w:p>
+    <w:p>
+      <w:pPr>
+        <w:pStyle w:val="ListBullet"/>
+        <w:spacing w:after="60" w:line="264" w:lineRule="auto"/>
+      </w:pPr>
+      <w:r>
+        <w:rPr>
+          <w:rFonts w:ascii="Times New Roman" w:hAnsi="Times New Roman" w:cs="Times New Roman" w:eastAsia="Times New Roman"/>
+          <w:sz w:val="23"/>
+        </w:rPr>
+        <w:t>Conversations do not retrain the model.</w:t>
+      </w:r>
+    </w:p>
+    <w:p>
+      <w:pPr>
+        <w:pStyle w:val="ListBullet"/>
+        <w:spacing w:after="60" w:line="264" w:lineRule="auto"/>
+      </w:pPr>
+      <w:r>
+        <w:rPr>
+          <w:rFonts w:ascii="Times New Roman" w:hAnsi="Times New Roman" w:cs="Times New Roman" w:eastAsia="Times New Roman"/>
+          <w:sz w:val="23"/>
+        </w:rPr>
+        <w:t>Automatic learning from every message: not implemented.</w:t>
+      </w:r>
     </w:p>
     <w:p>
       <w:pPr>

</xml_diff>